<commit_message>
latest proposal draft 02/03
</commit_message>
<xml_diff>
--- a/Proposals/ProposalWriteDraftLatest.docx
+++ b/Proposals/ProposalWriteDraftLatest.docx
@@ -645,7 +645,7 @@
         <w:jc w:val="center"/>
         <w:rPr>
           <w:rStyle w:val="Heading1Char"/>
-          <w:rFonts w:ascii="TH Sarabun New" w:hAnsi="TH Sarabun New" w:hint="cs"/>
+          <w:rFonts w:ascii="TH Sarabun New" w:hAnsi="TH Sarabun New"/>
           <w:sz w:val="40"/>
           <w:szCs w:val="40"/>
           <w:lang w:bidi="th-TH"/>
@@ -681,6 +681,7 @@
           <w:rFonts w:ascii="TH Sarabun New" w:hAnsi="TH Sarabun New"/>
           <w:b/>
           <w:bCs/>
+          <w:noProof/>
           <w:sz w:val="36"/>
         </w:rPr>
         <mc:AlternateContent>
@@ -895,17 +896,16 @@
     <w:p>
       <w:pPr>
         <w:rPr>
-          <w:rFonts w:ascii="TH Sarabun New" w:hAnsi="TH Sarabun New" w:cs="TH Sarabun New"/>
-        </w:rPr>
-      </w:pPr>
-      <w:r>
-        <w:rPr>
-          <w:rStyle w:val="a3"/>
-          <w:rFonts w:ascii="TH Sarabun New" w:eastAsia="Calibri" w:hAnsi="TH Sarabun New" w:cs="TH Sarabun New"/>
+          <w:rFonts w:ascii="TH Sarabun New" w:hAnsi="TH Sarabun New"/>
+        </w:rPr>
+      </w:pPr>
+      <w:r>
+        <w:rPr>
+          <w:rStyle w:val="a3"/>
+          <w:rFonts w:ascii="TH Sarabun New" w:eastAsia="Calibri" w:hAnsi="TH Sarabun New"/>
           <w:color w:val="0D0D0D"/>
           <w:kern w:val="0"/>
           <w:sz w:val="32"/>
-          <w:szCs w:val="32"/>
           <w:cs/>
           <w:lang w:eastAsia="en-US" w:bidi="th-TH"/>
         </w:rPr>
@@ -914,11 +914,10 @@
       <w:r>
         <w:rPr>
           <w:rStyle w:val="a3"/>
-          <w:rFonts w:ascii="TH Sarabun New" w:eastAsia="Calibri" w:hAnsi="TH Sarabun New" w:cs="TH Sarabun New"/>
+          <w:rFonts w:ascii="TH Sarabun New" w:eastAsia="Calibri" w:hAnsi="TH Sarabun New"/>
           <w:color w:val="0D0D0D"/>
           <w:kern w:val="0"/>
           <w:sz w:val="32"/>
-          <w:szCs w:val="32"/>
           <w:lang w:eastAsia="en-US" w:bidi="th-TH"/>
         </w:rPr>
         <w:t>6610110289</w:t>
@@ -941,23 +940,31 @@
         <w:pStyle w:val="Heading1"/>
         <w:rPr>
           <w:rFonts w:ascii="TH Sarabun New" w:hAnsi="TH Sarabun New"/>
-        </w:rPr>
-      </w:pPr>
-      <w:r>
-        <w:rPr>
-          <w:rFonts w:ascii="TH Sarabun New" w:hAnsi="TH Sarabun New"/>
+          <w:sz w:val="36"/>
+        </w:rPr>
+      </w:pPr>
+      <w:r>
+        <w:rPr>
+          <w:rFonts w:ascii="TH Sarabun New" w:hAnsi="TH Sarabun New"/>
+          <w:b/>
+          <w:bCs w:val="0"/>
+          <w:sz w:val="36"/>
         </w:rPr>
         <w:t>3</w:t>
       </w:r>
       <w:r>
         <w:rPr>
           <w:rFonts w:ascii="TH Sarabun New" w:hAnsi="TH Sarabun New"/>
+          <w:b/>
+          <w:bCs w:val="0"/>
+          <w:sz w:val="36"/>
         </w:rPr>
         <w:t>.</w:t>
       </w:r>
       <w:r>
         <w:rPr>
           <w:rFonts w:ascii="TH Sarabun New" w:hAnsi="TH Sarabun New"/>
+          <w:sz w:val="36"/>
           <w:cs/>
         </w:rPr>
         <w:t xml:space="preserve"> อาจารย์ที่ปรึกษาโครงงาน</w:t>
@@ -1002,12 +1009,16 @@
         <w:pStyle w:val="Heading1"/>
         <w:rPr>
           <w:rFonts w:ascii="TH Sarabun New" w:hAnsi="TH Sarabun New"/>
-        </w:rPr>
-      </w:pPr>
-      <w:r>
-        <w:rPr>
-          <w:rStyle w:val="a3"/>
-          <w:rFonts w:ascii="TH Sarabun New" w:hAnsi="TH Sarabun New"/>
+          <w:sz w:val="36"/>
+        </w:rPr>
+      </w:pPr>
+      <w:r>
+        <w:rPr>
+          <w:rStyle w:val="a3"/>
+          <w:rFonts w:ascii="TH Sarabun New" w:hAnsi="TH Sarabun New"/>
+          <w:b/>
+          <w:bCs w:val="0"/>
+          <w:sz w:val="36"/>
         </w:rPr>
         <w:t>4</w:t>
       </w:r>
@@ -1015,6 +1026,9 @@
         <w:rPr>
           <w:rStyle w:val="a3"/>
           <w:rFonts w:ascii="TH Sarabun New" w:hAnsi="TH Sarabun New"/>
+          <w:b/>
+          <w:bCs w:val="0"/>
+          <w:sz w:val="36"/>
         </w:rPr>
         <w:t>.</w:t>
       </w:r>
@@ -1022,6 +1036,7 @@
         <w:rPr>
           <w:rStyle w:val="a3"/>
           <w:rFonts w:ascii="TH Sarabun New" w:hAnsi="TH Sarabun New"/>
+          <w:sz w:val="36"/>
           <w:cs/>
           <w:lang w:bidi="th-TH"/>
         </w:rPr>
@@ -1370,7 +1385,78 @@
           <w:cs/>
           <w:lang w:bidi="th-TH"/>
         </w:rPr>
-        <w:t>เพื่อส่งเสริมทักษะทางภาษาอังกฤษ ทั้งด้านการฟัง (</w:t>
+        <w:t>เพื่อส่งเสริมทักษะทางภาษาอังกฤษ ทั้งด้าน</w:t>
+      </w:r>
+      <w:r>
+        <w:rPr>
+          <w:rStyle w:val="a3"/>
+          <w:rFonts w:ascii="TH Sarabun New" w:hAnsi="TH Sarabun New" w:cs="TH Sarabun New"/>
+          <w:sz w:val="32"/>
+          <w:szCs w:val="32"/>
+          <w:cs/>
+          <w:lang w:bidi="th-TH"/>
+        </w:rPr>
+        <w:t>การเขียน (</w:t>
+      </w:r>
+      <w:r>
+        <w:rPr>
+          <w:rStyle w:val="a3"/>
+          <w:rFonts w:ascii="TH Sarabun New" w:hAnsi="TH Sarabun New" w:cs="TH Sarabun New"/>
+          <w:sz w:val="32"/>
+          <w:szCs w:val="32"/>
+        </w:rPr>
+        <w:t>Writing</w:t>
+      </w:r>
+      <w:r>
+        <w:rPr>
+          <w:rStyle w:val="a3"/>
+          <w:rFonts w:ascii="TH Sarabun New" w:hAnsi="TH Sarabun New" w:cs="TH Sarabun New"/>
+          <w:sz w:val="32"/>
+          <w:szCs w:val="32"/>
+          <w:lang w:bidi="th-TH"/>
+        </w:rPr>
+        <w:t xml:space="preserve">) </w:t>
+      </w:r>
+      <w:r>
+        <w:rPr>
+          <w:rStyle w:val="a3"/>
+          <w:rFonts w:ascii="TH Sarabun New" w:hAnsi="TH Sarabun New" w:cs="TH Sarabun New"/>
+          <w:sz w:val="32"/>
+          <w:szCs w:val="32"/>
+          <w:cs/>
+          <w:lang w:bidi="th-TH"/>
+        </w:rPr>
+        <w:t>การอ่าน (</w:t>
+      </w:r>
+      <w:r>
+        <w:rPr>
+          <w:rStyle w:val="a3"/>
+          <w:rFonts w:ascii="TH Sarabun New" w:hAnsi="TH Sarabun New" w:cs="TH Sarabun New"/>
+          <w:sz w:val="32"/>
+          <w:szCs w:val="32"/>
+        </w:rPr>
+        <w:t>Reading</w:t>
+      </w:r>
+      <w:r>
+        <w:rPr>
+          <w:rStyle w:val="a3"/>
+          <w:rFonts w:ascii="TH Sarabun New" w:hAnsi="TH Sarabun New" w:cs="TH Sarabun New"/>
+          <w:sz w:val="32"/>
+          <w:szCs w:val="32"/>
+          <w:lang w:bidi="th-TH"/>
+        </w:rPr>
+        <w:t xml:space="preserve">) </w:t>
+      </w:r>
+      <w:r>
+        <w:rPr>
+          <w:rStyle w:val="a3"/>
+          <w:rFonts w:ascii="TH Sarabun New" w:hAnsi="TH Sarabun New" w:cs="TH Sarabun New"/>
+          <w:sz w:val="32"/>
+          <w:szCs w:val="32"/>
+          <w:cs/>
+          <w:lang w:bidi="th-TH"/>
+        </w:rPr>
+        <w:t>การฟัง (</w:t>
       </w:r>
       <w:r>
         <w:rPr>
@@ -1400,56 +1486,28 @@
           <w:cs/>
           <w:lang w:bidi="th-TH"/>
         </w:rPr>
-        <w:t>การอ่าน (</w:t>
-      </w:r>
-      <w:r>
-        <w:rPr>
-          <w:rStyle w:val="a3"/>
-          <w:rFonts w:ascii="TH Sarabun New" w:hAnsi="TH Sarabun New" w:cs="TH Sarabun New"/>
-          <w:sz w:val="32"/>
-          <w:szCs w:val="32"/>
-        </w:rPr>
-        <w:t>Reading</w:t>
-      </w:r>
-      <w:r>
-        <w:rPr>
-          <w:rStyle w:val="a3"/>
-          <w:rFonts w:ascii="TH Sarabun New" w:hAnsi="TH Sarabun New" w:cs="TH Sarabun New"/>
-          <w:sz w:val="32"/>
-          <w:szCs w:val="32"/>
-          <w:lang w:bidi="th-TH"/>
-        </w:rPr>
-        <w:t xml:space="preserve">) </w:t>
-      </w:r>
-      <w:r>
-        <w:rPr>
-          <w:rStyle w:val="a3"/>
-          <w:rFonts w:ascii="TH Sarabun New" w:hAnsi="TH Sarabun New" w:cs="TH Sarabun New"/>
-          <w:sz w:val="32"/>
-          <w:szCs w:val="32"/>
-          <w:cs/>
-          <w:lang w:bidi="th-TH"/>
-        </w:rPr>
-        <w:t>และการเขียน (</w:t>
-      </w:r>
-      <w:r>
-        <w:rPr>
-          <w:rStyle w:val="a3"/>
-          <w:rFonts w:ascii="TH Sarabun New" w:hAnsi="TH Sarabun New" w:cs="TH Sarabun New"/>
-          <w:sz w:val="32"/>
-          <w:szCs w:val="32"/>
-        </w:rPr>
-        <w:t>Writing</w:t>
-      </w:r>
-      <w:r>
-        <w:rPr>
-          <w:rStyle w:val="a3"/>
-          <w:rFonts w:ascii="TH Sarabun New" w:hAnsi="TH Sarabun New" w:cs="TH Sarabun New"/>
-          <w:sz w:val="32"/>
-          <w:szCs w:val="32"/>
-          <w:lang w:bidi="th-TH"/>
-        </w:rPr>
-        <w:t xml:space="preserve">) </w:t>
+        <w:t>และ</w:t>
+      </w:r>
+      <w:r>
+        <w:rPr>
+          <w:rStyle w:val="a3"/>
+          <w:rFonts w:ascii="TH Sarabun New" w:hAnsi="TH Sarabun New" w:cs="TH Sarabun New" w:hint="cs"/>
+          <w:sz w:val="32"/>
+          <w:szCs w:val="32"/>
+          <w:cs/>
+          <w:lang w:bidi="th-TH"/>
+        </w:rPr>
+        <w:t>การพูด</w:t>
+      </w:r>
+      <w:r>
+        <w:rPr>
+          <w:rStyle w:val="a3"/>
+          <w:rFonts w:ascii="TH Sarabun New" w:hAnsi="TH Sarabun New" w:cs="TH Sarabun New"/>
+          <w:sz w:val="32"/>
+          <w:szCs w:val="32"/>
+          <w:lang w:bidi="th-TH"/>
+        </w:rPr>
+        <w:t xml:space="preserve"> (Speaking) </w:t>
       </w:r>
       <w:r>
         <w:rPr>
@@ -1471,9 +1529,10 @@
           <w:numId w:val="4"/>
         </w:numPr>
         <w:spacing w:after="0" w:line="240" w:lineRule="auto"/>
+        <w:ind w:left="709"/>
         <w:contextualSpacing/>
         <w:rPr>
-          <w:rFonts w:ascii="TH Sarabun New" w:hAnsi="TH Sarabun New" w:cs="TH Sarabun New"/>
+          <w:rFonts w:ascii="TH Sarabun New" w:hAnsi="TH Sarabun New" w:cs="TH Sarabun New" w:hint="cs"/>
         </w:rPr>
       </w:pPr>
       <w:r>
@@ -1488,42 +1547,6 @@
         <w:lastRenderedPageBreak/>
         <w:t>เพื่อสร้างเจตคติที่ดีและแรงจูงใจในการเรียนรู้ภาษาอังกฤษ ให้ผู้เล่นเกิดความมั่นใจและกล้าแสดงออกทางภาษามากขึ้น</w:t>
       </w:r>
-    </w:p>
-    <w:p>
-      <w:pPr>
-        <w:pStyle w:val="Textbody"/>
-        <w:numPr>
-          <w:ilvl w:val="0"/>
-          <w:numId w:val="4"/>
-        </w:numPr>
-        <w:spacing w:line="240" w:lineRule="auto"/>
-        <w:rPr>
-          <w:rFonts w:ascii="TH Sarabun New" w:hAnsi="TH Sarabun New" w:cs="TH Sarabun New"/>
-        </w:rPr>
-      </w:pPr>
-      <w:r>
-        <w:rPr>
-          <w:rStyle w:val="a3"/>
-          <w:rFonts w:ascii="TH Sarabun New" w:hAnsi="TH Sarabun New" w:cs="TH Sarabun New"/>
-          <w:sz w:val="32"/>
-          <w:szCs w:val="32"/>
-          <w:cs/>
-          <w:lang w:bidi="th-TH"/>
-        </w:rPr>
-        <w:t>เพื่อนำเสนอทางเลือกในการใช้สื่อเทคโนโลยีและเวลาว่างให้เกิดประโยชน์ต่อการพัฒนาตนเอง</w:t>
-      </w:r>
-    </w:p>
-    <w:p>
-      <w:pPr>
-        <w:pStyle w:val="a2"/>
-        <w:spacing w:after="0"/>
-        <w:contextualSpacing w:val="0"/>
-        <w:rPr>
-          <w:rFonts w:ascii="TH Sarabun New" w:hAnsi="TH Sarabun New" w:cs="TH Sarabun New"/>
-          <w:sz w:val="32"/>
-          <w:szCs w:val="32"/>
-        </w:rPr>
-      </w:pPr>
     </w:p>
     <w:p>
       <w:pPr>
@@ -1805,29 +1828,40 @@
       </w:r>
     </w:p>
     <w:p>
-      <w:pPr>
-        <w:pStyle w:val="Textbody"/>
-        <w:rPr>
-          <w:rFonts w:ascii="TH Sarabun New" w:hAnsi="TH Sarabun New" w:cs="TH Sarabun New"/>
-        </w:rPr>
-      </w:pPr>
-      <w:r>
-        <w:rPr>
-          <w:rStyle w:val="a3"/>
-          <w:rFonts w:ascii="TH Sarabun New" w:hAnsi="TH Sarabun New" w:cs="TH Sarabun New"/>
-          <w:sz w:val="32"/>
-          <w:szCs w:val="32"/>
-          <w:cs/>
-          <w:lang w:bidi="th-TH"/>
-        </w:rPr>
-        <w:t xml:space="preserve">ในการพัฒนาโครงงานเกมเพื่อการเรียนรู้ภาษาอังกฤษบนแพลตฟอร์ม </w:t>
-      </w:r>
-      <w:r>
-        <w:rPr>
-          <w:rStyle w:val="a3"/>
-          <w:rFonts w:ascii="TH Sarabun New" w:hAnsi="TH Sarabun New" w:cs="TH Sarabun New"/>
-          <w:sz w:val="32"/>
-          <w:szCs w:val="32"/>
+      <w:r>
+        <w:rPr>
+          <w:rStyle w:val="a3"/>
+          <w:rFonts w:ascii="TH Sarabun New" w:hAnsi="TH Sarabun New"/>
+          <w:sz w:val="32"/>
+          <w:cs/>
+          <w:lang w:bidi="th-TH"/>
+        </w:rPr>
+        <w:t>ในการ</w:t>
+      </w:r>
+      <w:r>
+        <w:rPr>
+          <w:rFonts w:ascii="TH Sarabun New" w:hAnsi="TH Sarabun New"/>
+          <w:sz w:val="32"/>
+          <w:cs/>
+          <w:lang w:bidi="th-TH"/>
+        </w:rPr>
+        <w:t>รศึกษาข้อมูลในการพัฒนา</w:t>
+      </w:r>
+      <w:r>
+        <w:rPr>
+          <w:rStyle w:val="a3"/>
+          <w:rFonts w:ascii="TH Sarabun New" w:hAnsi="TH Sarabun New"/>
+          <w:sz w:val="32"/>
+          <w:cs/>
+          <w:lang w:bidi="th-TH"/>
+        </w:rPr>
+        <w:t xml:space="preserve">เกมเพื่อการเรียนรู้ภาษาอังกฤษบนแพลตฟอร์ม </w:t>
+      </w:r>
+      <w:r>
+        <w:rPr>
+          <w:rStyle w:val="a3"/>
+          <w:rFonts w:ascii="TH Sarabun New" w:hAnsi="TH Sarabun New"/>
+          <w:sz w:val="32"/>
           <w:lang w:bidi="th-TH"/>
         </w:rPr>
         <w:t xml:space="preserve">Roblox </w:t>
@@ -1835,19 +1869,21 @@
       <w:r>
         <w:rPr>
           <w:rStyle w:val="a3"/>
-          <w:rFonts w:ascii="TH Sarabun New" w:hAnsi="TH Sarabun New" w:cs="TH Sarabun New"/>
-          <w:sz w:val="32"/>
-          <w:szCs w:val="32"/>
-          <w:cs/>
-          <w:lang w:bidi="th-TH"/>
-        </w:rPr>
-        <w:t>คณะผู้จัดทำได้ศึกษาทฤษฎีและหลักการที่เกี่ยวข้อง เพื่อใช้เป็นพื้นฐานในการออกแบบและพัฒนาระบบให้มีประสิทธิภาพ โดยมีหัวข้อสำคัญดังต่อไปนี้</w:t>
-      </w:r>
-    </w:p>
-    <w:p>
-      <w:pPr>
-        <w:pStyle w:val="Heading4"/>
-        <w:spacing w:before="0" w:after="140" w:line="276" w:lineRule="auto"/>
+          <w:rFonts w:ascii="TH Sarabun New" w:hAnsi="TH Sarabun New"/>
+          <w:sz w:val="32"/>
+          <w:cs/>
+          <w:lang w:bidi="th-TH"/>
+        </w:rPr>
+        <w:t>คณะผู้จัดทำได้ศึกษาทฤษฎีและหลักการที่เกี่ยวข้อง โดยมีหัวข้อสำคัญดังต่อไปนี้</w:t>
+      </w:r>
+    </w:p>
+    <w:p>
+      <w:pPr>
+        <w:pStyle w:val="ListParagraph"/>
+        <w:numPr>
+          <w:ilvl w:val="0"/>
+          <w:numId w:val="29"/>
+        </w:numPr>
         <w:rPr>
           <w:rFonts w:ascii="TH Sarabun New" w:hAnsi="TH Sarabun New" w:cs="TH Sarabun New"/>
           <w:sz w:val="32"/>
@@ -1859,380 +1895,341 @@
         <w:rPr>
           <w:rStyle w:val="StrongEmphasis"/>
           <w:rFonts w:ascii="TH Sarabun New" w:hAnsi="TH Sarabun New" w:cs="TH Sarabun New"/>
-          <w:lang w:bidi="th-TH"/>
-        </w:rPr>
-        <w:t xml:space="preserve">1. </w:t>
+          <w:sz w:val="32"/>
+          <w:szCs w:val="32"/>
+          <w:cs/>
+          <w:lang w:bidi="th-TH"/>
+        </w:rPr>
+        <w:t xml:space="preserve">แพลตฟอร์ม </w:t>
       </w:r>
       <w:r>
         <w:rPr>
           <w:rStyle w:val="StrongEmphasis"/>
           <w:rFonts w:ascii="TH Sarabun New" w:hAnsi="TH Sarabun New" w:cs="TH Sarabun New"/>
-          <w:cs/>
-          <w:lang w:bidi="th-TH"/>
-        </w:rPr>
-        <w:t xml:space="preserve">แพลตฟอร์ม </w:t>
+          <w:sz w:val="32"/>
+          <w:szCs w:val="32"/>
+          <w:lang w:bidi="th-TH"/>
+        </w:rPr>
+        <w:t xml:space="preserve">Roblox </w:t>
       </w:r>
       <w:r>
         <w:rPr>
           <w:rStyle w:val="StrongEmphasis"/>
           <w:rFonts w:ascii="TH Sarabun New" w:hAnsi="TH Sarabun New" w:cs="TH Sarabun New"/>
+          <w:sz w:val="32"/>
+          <w:szCs w:val="32"/>
+          <w:cs/>
+          <w:lang w:bidi="th-TH"/>
+        </w:rPr>
+        <w:t xml:space="preserve">และ </w:t>
+      </w:r>
+      <w:r>
+        <w:rPr>
+          <w:rStyle w:val="StrongEmphasis"/>
+          <w:rFonts w:ascii="TH Sarabun New" w:hAnsi="TH Sarabun New" w:cs="TH Sarabun New"/>
+          <w:sz w:val="32"/>
+          <w:szCs w:val="32"/>
+          <w:lang w:bidi="th-TH"/>
+        </w:rPr>
+        <w:t>Roblox Studio (Roblox Platform &amp; Engine)</w:t>
+      </w:r>
+    </w:p>
+    <w:p>
+      <w:pPr>
+        <w:pStyle w:val="ListParagraph"/>
+        <w:numPr>
+          <w:ilvl w:val="1"/>
+          <w:numId w:val="29"/>
+        </w:numPr>
+        <w:rPr>
+          <w:rFonts w:ascii="TH Sarabun New" w:hAnsi="TH Sarabun New" w:cs="TH Sarabun New"/>
+          <w:sz w:val="32"/>
+          <w:szCs w:val="32"/>
+          <w:lang w:bidi="th-TH"/>
+        </w:rPr>
+      </w:pPr>
+      <w:r>
+        <w:rPr>
+          <w:rFonts w:ascii="TH Sarabun New" w:hAnsi="TH Sarabun New" w:cs="TH Sarabun New"/>
+          <w:sz w:val="32"/>
+          <w:szCs w:val="32"/>
+          <w:cs/>
+          <w:lang w:bidi="th-TH"/>
+        </w:rPr>
+        <w:t xml:space="preserve">สถาปัตยกรรมของ </w:t>
+      </w:r>
+      <w:r>
+        <w:rPr>
+          <w:rFonts w:ascii="TH Sarabun New" w:hAnsi="TH Sarabun New" w:cs="TH Sarabun New"/>
+          <w:sz w:val="32"/>
+          <w:szCs w:val="32"/>
+          <w:lang w:bidi="th-TH"/>
+        </w:rPr>
+        <w:t>Roblox (Roblox Architecture)</w:t>
+      </w:r>
+    </w:p>
+    <w:p>
+      <w:pPr>
+        <w:ind w:firstLine="425"/>
+        <w:rPr>
+          <w:rFonts w:ascii="TH Sarabun New" w:hAnsi="TH Sarabun New"/>
+          <w:sz w:val="32"/>
+          <w:lang w:bidi="th-TH"/>
+        </w:rPr>
+      </w:pPr>
+      <w:r>
+        <w:rPr>
+          <w:rFonts w:ascii="TH Sarabun New" w:hAnsi="TH Sarabun New"/>
+          <w:sz w:val="32"/>
           <w:lang w:bidi="th-TH"/>
         </w:rPr>
         <w:t xml:space="preserve">Roblox </w:t>
       </w:r>
       <w:r>
         <w:rPr>
+          <w:rFonts w:ascii="TH Sarabun New" w:hAnsi="TH Sarabun New"/>
+          <w:sz w:val="32"/>
+          <w:cs/>
+          <w:lang w:bidi="th-TH"/>
+        </w:rPr>
+        <w:t>เป็นแพลตฟอร์มเกมออนไลน์แบบผู้เล่นหลายคน (</w:t>
+      </w:r>
+      <w:r>
+        <w:rPr>
+          <w:rFonts w:ascii="TH Sarabun New" w:hAnsi="TH Sarabun New"/>
+          <w:sz w:val="32"/>
+          <w:lang w:bidi="th-TH"/>
+        </w:rPr>
+        <w:t xml:space="preserve">Massively Multiplayer Online - MMO) </w:t>
+      </w:r>
+      <w:r>
+        <w:rPr>
+          <w:rFonts w:ascii="TH Sarabun New" w:hAnsi="TH Sarabun New"/>
+          <w:sz w:val="32"/>
+          <w:cs/>
+          <w:lang w:bidi="th-TH"/>
+        </w:rPr>
+        <w:t xml:space="preserve">ที่ทำงานภายใต้สถาปัตยกรรมแบบ </w:t>
+      </w:r>
+      <w:r>
+        <w:rPr>
+          <w:rFonts w:ascii="TH Sarabun New" w:hAnsi="TH Sarabun New"/>
+          <w:sz w:val="32"/>
+          <w:lang w:bidi="th-TH"/>
+        </w:rPr>
+        <w:t xml:space="preserve">Client-Server Model </w:t>
+      </w:r>
+      <w:r>
+        <w:rPr>
+          <w:rFonts w:ascii="TH Sarabun New" w:hAnsi="TH Sarabun New"/>
+          <w:sz w:val="32"/>
+          <w:cs/>
+          <w:lang w:bidi="th-TH"/>
+        </w:rPr>
+        <w:t xml:space="preserve">โดยตัวเกมถูกขับเคลื่อนด้วย </w:t>
+      </w:r>
+      <w:r>
+        <w:rPr>
           <w:rStyle w:val="StrongEmphasis"/>
-          <w:rFonts w:ascii="TH Sarabun New" w:hAnsi="TH Sarabun New" w:cs="TH Sarabun New"/>
-          <w:cs/>
-          <w:lang w:bidi="th-TH"/>
-        </w:rPr>
-        <w:t xml:space="preserve">และ </w:t>
-      </w:r>
-      <w:r>
-        <w:rPr>
-          <w:rStyle w:val="StrongEmphasis"/>
-          <w:rFonts w:ascii="TH Sarabun New" w:hAnsi="TH Sarabun New" w:cs="TH Sarabun New"/>
-          <w:lang w:bidi="th-TH"/>
-        </w:rPr>
-        <w:t>Roblox Studio (Roblox Platform &amp; Engine)</w:t>
-      </w:r>
-    </w:p>
-    <w:p>
-      <w:pPr>
-        <w:pStyle w:val="Textbody"/>
-        <w:rPr>
-          <w:rFonts w:ascii="TH Sarabun New" w:hAnsi="TH Sarabun New" w:cs="TH Sarabun New"/>
-          <w:sz w:val="32"/>
-          <w:szCs w:val="32"/>
-          <w:lang w:bidi="th-TH"/>
-        </w:rPr>
-      </w:pPr>
-      <w:r>
-        <w:rPr>
-          <w:rStyle w:val="StrongEmphasis"/>
-          <w:rFonts w:ascii="TH Sarabun New" w:hAnsi="TH Sarabun New" w:cs="TH Sarabun New"/>
-          <w:lang w:bidi="th-TH"/>
-        </w:rPr>
-        <w:t>1.1</w:t>
-      </w:r>
-      <w:r>
-        <w:rPr>
-          <w:rStyle w:val="StrongEmphasis"/>
-          <w:rFonts w:ascii="TH Sarabun New" w:hAnsi="TH Sarabun New" w:cs="TH Sarabun New"/>
-          <w:cs/>
-          <w:lang w:bidi="th-TH"/>
-        </w:rPr>
-        <w:t xml:space="preserve"> สถาปัตยกรรมของ </w:t>
-      </w:r>
-      <w:r>
-        <w:rPr>
-          <w:rStyle w:val="StrongEmphasis"/>
-          <w:rFonts w:ascii="TH Sarabun New" w:hAnsi="TH Sarabun New" w:cs="TH Sarabun New"/>
-          <w:lang w:bidi="th-TH"/>
-        </w:rPr>
-        <w:t>Roblox (Roblox Architecture)</w:t>
-      </w:r>
-      <w:r>
-        <w:rPr>
-          <w:rFonts w:ascii="TH Sarabun New" w:hAnsi="TH Sarabun New" w:cs="TH Sarabun New"/>
-          <w:sz w:val="32"/>
-          <w:szCs w:val="32"/>
-          <w:lang w:bidi="th-TH"/>
-        </w:rPr>
-        <w:br/>
+          <w:rFonts w:ascii="TH Sarabun New" w:hAnsi="TH Sarabun New"/>
+          <w:b w:val="0"/>
+          <w:bCs w:val="0"/>
+          <w:sz w:val="32"/>
+          <w:lang w:bidi="th-TH"/>
+        </w:rPr>
+        <w:t>Roblox Engine</w:t>
+      </w:r>
+      <w:r>
+        <w:rPr>
+          <w:rFonts w:ascii="TH Sarabun New" w:hAnsi="TH Sarabun New"/>
+          <w:sz w:val="32"/>
+          <w:lang w:bidi="th-TH"/>
+        </w:rPr>
+        <w:t xml:space="preserve"> </w:t>
+      </w:r>
+      <w:r>
+        <w:rPr>
+          <w:rFonts w:ascii="TH Sarabun New" w:hAnsi="TH Sarabun New"/>
+          <w:sz w:val="32"/>
+          <w:cs/>
+          <w:lang w:bidi="th-TH"/>
+        </w:rPr>
+        <w:t xml:space="preserve">ซึ่งเป็น </w:t>
+      </w:r>
+      <w:r>
+        <w:rPr>
+          <w:rFonts w:ascii="TH Sarabun New" w:hAnsi="TH Sarabun New"/>
+          <w:sz w:val="32"/>
+          <w:lang w:bidi="th-TH"/>
+        </w:rPr>
+        <w:t xml:space="preserve">Game Engine </w:t>
+      </w:r>
+      <w:r>
+        <w:rPr>
+          <w:rFonts w:ascii="TH Sarabun New" w:hAnsi="TH Sarabun New"/>
+          <w:sz w:val="32"/>
+          <w:cs/>
+          <w:lang w:bidi="th-TH"/>
+        </w:rPr>
+        <w:t>ที่ประมวลผลระบบฟิสิกส์ (</w:t>
+      </w:r>
+      <w:r>
+        <w:rPr>
+          <w:rFonts w:ascii="TH Sarabun New" w:hAnsi="TH Sarabun New"/>
+          <w:sz w:val="32"/>
+          <w:lang w:bidi="th-TH"/>
+        </w:rPr>
+        <w:t xml:space="preserve">Physics) </w:t>
+      </w:r>
+      <w:r>
+        <w:rPr>
+          <w:rFonts w:ascii="TH Sarabun New" w:hAnsi="TH Sarabun New"/>
+          <w:sz w:val="32"/>
+          <w:cs/>
+          <w:lang w:bidi="th-TH"/>
+        </w:rPr>
+        <w:t>และการแสดงผลกราฟิก (</w:t>
+      </w:r>
+      <w:r>
+        <w:rPr>
+          <w:rFonts w:ascii="TH Sarabun New" w:hAnsi="TH Sarabun New"/>
+          <w:sz w:val="32"/>
+          <w:lang w:bidi="th-TH"/>
+        </w:rPr>
+        <w:t xml:space="preserve">Rendering) </w:t>
+      </w:r>
+      <w:r>
+        <w:rPr>
+          <w:rFonts w:ascii="TH Sarabun New" w:hAnsi="TH Sarabun New"/>
+          <w:sz w:val="32"/>
+          <w:cs/>
+          <w:lang w:bidi="th-TH"/>
+        </w:rPr>
+        <w:t>แบบเรียลไทม์หลักการทำงานเริ่มต้นเมื่อผู้เล่น (</w:t>
+      </w:r>
+      <w:r>
+        <w:rPr>
+          <w:rFonts w:ascii="TH Sarabun New" w:hAnsi="TH Sarabun New"/>
+          <w:sz w:val="32"/>
+          <w:lang w:bidi="th-TH"/>
+        </w:rPr>
+        <w:t xml:space="preserve">Client) </w:t>
+      </w:r>
+      <w:r>
+        <w:rPr>
+          <w:rFonts w:ascii="TH Sarabun New" w:hAnsi="TH Sarabun New"/>
+          <w:sz w:val="32"/>
+          <w:cs/>
+          <w:lang w:bidi="th-TH"/>
+        </w:rPr>
+        <w:t>เข้าสู่เกม ตัวโปรแกรมจะทำการส่งข้อมูล (</w:t>
+      </w:r>
+      <w:r>
+        <w:rPr>
+          <w:rFonts w:ascii="TH Sarabun New" w:hAnsi="TH Sarabun New"/>
+          <w:sz w:val="32"/>
+          <w:lang w:bidi="th-TH"/>
+        </w:rPr>
+        <w:t xml:space="preserve">Replication) </w:t>
+      </w:r>
+      <w:r>
+        <w:rPr>
+          <w:rFonts w:ascii="TH Sarabun New" w:hAnsi="TH Sarabun New"/>
+          <w:sz w:val="32"/>
+          <w:cs/>
+          <w:lang w:bidi="th-TH"/>
+        </w:rPr>
+        <w:t>ระหว่างเครื่องของผู้เล่นและ</w:t>
+      </w:r>
+      <w:proofErr w:type="spellStart"/>
+      <w:r>
+        <w:rPr>
+          <w:rFonts w:ascii="TH Sarabun New" w:hAnsi="TH Sarabun New"/>
+          <w:sz w:val="32"/>
+          <w:cs/>
+          <w:lang w:bidi="th-TH"/>
+        </w:rPr>
+        <w:t>เซิร์ฟเวอร์</w:t>
+      </w:r>
+      <w:proofErr w:type="spellEnd"/>
+      <w:r>
+        <w:rPr>
+          <w:rFonts w:ascii="TH Sarabun New" w:hAnsi="TH Sarabun New"/>
+          <w:sz w:val="32"/>
+          <w:cs/>
+          <w:lang w:bidi="th-TH"/>
+        </w:rPr>
+        <w:t xml:space="preserve"> (</w:t>
+      </w:r>
+      <w:r>
+        <w:rPr>
+          <w:rFonts w:ascii="TH Sarabun New" w:hAnsi="TH Sarabun New"/>
+          <w:sz w:val="32"/>
+          <w:lang w:bidi="th-TH"/>
+        </w:rPr>
+        <w:t xml:space="preserve">Server) </w:t>
+      </w:r>
+      <w:r>
+        <w:rPr>
+          <w:rFonts w:ascii="TH Sarabun New" w:hAnsi="TH Sarabun New"/>
+          <w:sz w:val="32"/>
+          <w:cs/>
+          <w:lang w:bidi="th-TH"/>
+        </w:rPr>
+        <w:t xml:space="preserve">ของ </w:t>
+      </w:r>
+      <w:r>
+        <w:rPr>
+          <w:rFonts w:ascii="TH Sarabun New" w:hAnsi="TH Sarabun New"/>
+          <w:sz w:val="32"/>
+          <w:lang w:bidi="th-TH"/>
+        </w:rPr>
         <w:t xml:space="preserve">Roblox </w:t>
       </w:r>
       <w:r>
         <w:rPr>
-          <w:rFonts w:ascii="TH Sarabun New" w:hAnsi="TH Sarabun New" w:cs="TH Sarabun New"/>
-          <w:sz w:val="32"/>
-          <w:szCs w:val="32"/>
-          <w:cs/>
-          <w:lang w:bidi="th-TH"/>
-        </w:rPr>
-        <w:t>เป็นแพลตฟอร์มเกมออนไลน์แบบผู้เล่นหลายคน (</w:t>
-      </w:r>
-      <w:r>
-        <w:rPr>
-          <w:rFonts w:ascii="TH Sarabun New" w:hAnsi="TH Sarabun New" w:cs="TH Sarabun New"/>
-          <w:sz w:val="32"/>
-          <w:szCs w:val="32"/>
-          <w:lang w:bidi="th-TH"/>
-        </w:rPr>
-        <w:t xml:space="preserve">Massively Multiplayer Online - MMO) </w:t>
-      </w:r>
-      <w:r>
-        <w:rPr>
-          <w:rFonts w:ascii="TH Sarabun New" w:hAnsi="TH Sarabun New" w:cs="TH Sarabun New"/>
-          <w:sz w:val="32"/>
-          <w:szCs w:val="32"/>
-          <w:cs/>
-          <w:lang w:bidi="th-TH"/>
-        </w:rPr>
-        <w:t xml:space="preserve">ที่ทำงานภายใต้สถาปัตยกรรมแบบ </w:t>
-      </w:r>
-      <w:r>
-        <w:rPr>
-          <w:rFonts w:ascii="TH Sarabun New" w:hAnsi="TH Sarabun New" w:cs="TH Sarabun New"/>
-          <w:sz w:val="32"/>
-          <w:szCs w:val="32"/>
-          <w:lang w:bidi="th-TH"/>
-        </w:rPr>
-        <w:t xml:space="preserve">Client-Server Model </w:t>
-      </w:r>
-      <w:r>
-        <w:rPr>
-          <w:rFonts w:ascii="TH Sarabun New" w:hAnsi="TH Sarabun New" w:cs="TH Sarabun New"/>
-          <w:sz w:val="32"/>
-          <w:szCs w:val="32"/>
-          <w:cs/>
-          <w:lang w:bidi="th-TH"/>
-        </w:rPr>
-        <w:t xml:space="preserve">โดยตัวเกมถูกขับเคลื่อนด้วย </w:t>
-      </w:r>
-      <w:r>
-        <w:rPr>
-          <w:rStyle w:val="StrongEmphasis"/>
-          <w:rFonts w:ascii="TH Sarabun New" w:hAnsi="TH Sarabun New" w:cs="TH Sarabun New"/>
-          <w:lang w:bidi="th-TH"/>
-        </w:rPr>
-        <w:t>Roblox Engine</w:t>
-      </w:r>
-      <w:r>
-        <w:rPr>
-          <w:rFonts w:ascii="TH Sarabun New" w:hAnsi="TH Sarabun New" w:cs="TH Sarabun New"/>
-          <w:sz w:val="32"/>
-          <w:szCs w:val="32"/>
-          <w:lang w:bidi="th-TH"/>
-        </w:rPr>
-        <w:t xml:space="preserve"> </w:t>
-      </w:r>
-      <w:r>
-        <w:rPr>
-          <w:rFonts w:ascii="TH Sarabun New" w:hAnsi="TH Sarabun New" w:cs="TH Sarabun New"/>
-          <w:sz w:val="32"/>
-          <w:szCs w:val="32"/>
-          <w:cs/>
-          <w:lang w:bidi="th-TH"/>
-        </w:rPr>
-        <w:t xml:space="preserve">ซึ่งเป็น </w:t>
-      </w:r>
-      <w:r>
-        <w:rPr>
-          <w:rFonts w:ascii="TH Sarabun New" w:hAnsi="TH Sarabun New" w:cs="TH Sarabun New"/>
-          <w:sz w:val="32"/>
-          <w:szCs w:val="32"/>
-          <w:lang w:bidi="th-TH"/>
-        </w:rPr>
-        <w:t xml:space="preserve">Game Engine </w:t>
-      </w:r>
-      <w:r>
-        <w:rPr>
-          <w:rFonts w:ascii="TH Sarabun New" w:hAnsi="TH Sarabun New" w:cs="TH Sarabun New"/>
-          <w:sz w:val="32"/>
-          <w:szCs w:val="32"/>
-          <w:cs/>
-          <w:lang w:bidi="th-TH"/>
-        </w:rPr>
-        <w:t>ที่ประมวลผลระบบฟิสิกส์ (</w:t>
-      </w:r>
-      <w:r>
-        <w:rPr>
-          <w:rFonts w:ascii="TH Sarabun New" w:hAnsi="TH Sarabun New" w:cs="TH Sarabun New"/>
-          <w:sz w:val="32"/>
-          <w:szCs w:val="32"/>
-          <w:lang w:bidi="th-TH"/>
-        </w:rPr>
-        <w:t xml:space="preserve">Physics) </w:t>
-      </w:r>
-      <w:r>
-        <w:rPr>
-          <w:rFonts w:ascii="TH Sarabun New" w:hAnsi="TH Sarabun New" w:cs="TH Sarabun New"/>
-          <w:sz w:val="32"/>
-          <w:szCs w:val="32"/>
-          <w:cs/>
-          <w:lang w:bidi="th-TH"/>
-        </w:rPr>
-        <w:t>และการแสดงผลกราฟิก (</w:t>
-      </w:r>
-      <w:r>
-        <w:rPr>
-          <w:rFonts w:ascii="TH Sarabun New" w:hAnsi="TH Sarabun New" w:cs="TH Sarabun New"/>
-          <w:sz w:val="32"/>
-          <w:szCs w:val="32"/>
-          <w:lang w:bidi="th-TH"/>
-        </w:rPr>
-        <w:t xml:space="preserve">Rendering) </w:t>
-      </w:r>
-      <w:r>
-        <w:rPr>
-          <w:rFonts w:ascii="TH Sarabun New" w:hAnsi="TH Sarabun New" w:cs="TH Sarabun New"/>
-          <w:sz w:val="32"/>
-          <w:szCs w:val="32"/>
-          <w:cs/>
-          <w:lang w:bidi="th-TH"/>
-        </w:rPr>
-        <w:t>แบบเรียลไทม์</w:t>
-      </w:r>
-    </w:p>
-    <w:p>
-      <w:pPr>
-        <w:pStyle w:val="Textbody"/>
-        <w:rPr>
-          <w:rFonts w:ascii="TH Sarabun New" w:hAnsi="TH Sarabun New" w:cs="TH Sarabun New"/>
-          <w:sz w:val="32"/>
-          <w:szCs w:val="32"/>
-          <w:lang w:bidi="th-TH"/>
-        </w:rPr>
-      </w:pPr>
-      <w:r>
-        <w:rPr>
-          <w:rFonts w:ascii="TH Sarabun New" w:hAnsi="TH Sarabun New" w:cs="TH Sarabun New"/>
-          <w:sz w:val="32"/>
-          <w:szCs w:val="32"/>
-          <w:cs/>
-          <w:lang w:bidi="th-TH"/>
-        </w:rPr>
-        <w:t>หลักการทำงานเริ่มต้นเมื่อผู้เล่น (</w:t>
-      </w:r>
-      <w:r>
-        <w:rPr>
-          <w:rFonts w:ascii="TH Sarabun New" w:hAnsi="TH Sarabun New" w:cs="TH Sarabun New"/>
-          <w:sz w:val="32"/>
-          <w:szCs w:val="32"/>
-          <w:lang w:bidi="th-TH"/>
-        </w:rPr>
-        <w:t xml:space="preserve">Client) </w:t>
-      </w:r>
-      <w:r>
-        <w:rPr>
-          <w:rFonts w:ascii="TH Sarabun New" w:hAnsi="TH Sarabun New" w:cs="TH Sarabun New"/>
-          <w:sz w:val="32"/>
-          <w:szCs w:val="32"/>
-          <w:cs/>
-          <w:lang w:bidi="th-TH"/>
-        </w:rPr>
-        <w:t>เข้าสู่เกม ตัวโปรแกรมจะทำการส่งข้อมูล (</w:t>
-      </w:r>
-      <w:r>
-        <w:rPr>
-          <w:rFonts w:ascii="TH Sarabun New" w:hAnsi="TH Sarabun New" w:cs="TH Sarabun New"/>
-          <w:sz w:val="32"/>
-          <w:szCs w:val="32"/>
-          <w:lang w:bidi="th-TH"/>
-        </w:rPr>
-        <w:t xml:space="preserve">Replication) </w:t>
-      </w:r>
-      <w:r>
-        <w:rPr>
-          <w:rFonts w:ascii="TH Sarabun New" w:hAnsi="TH Sarabun New" w:cs="TH Sarabun New"/>
-          <w:sz w:val="32"/>
-          <w:szCs w:val="32"/>
-          <w:cs/>
-          <w:lang w:bidi="th-TH"/>
-        </w:rPr>
-        <w:t>ระหว่างเครื่องของผู้เล่นและ</w:t>
+          <w:rFonts w:ascii="TH Sarabun New" w:hAnsi="TH Sarabun New"/>
+          <w:sz w:val="32"/>
+          <w:cs/>
+          <w:lang w:bidi="th-TH"/>
+        </w:rPr>
+        <w:t>เพ</w:t>
       </w:r>
       <w:proofErr w:type="spellStart"/>
       <w:r>
         <w:rPr>
-          <w:rFonts w:ascii="TH Sarabun New" w:hAnsi="TH Sarabun New" w:cs="TH Sarabun New"/>
-          <w:sz w:val="32"/>
-          <w:szCs w:val="32"/>
-          <w:cs/>
-          <w:lang w:bidi="th-TH"/>
-        </w:rPr>
-        <w:t>เซิร์ฟเวอร์</w:t>
+          <w:rFonts w:ascii="TH Sarabun New" w:hAnsi="TH Sarabun New"/>
+          <w:sz w:val="32"/>
+          <w:cs/>
+          <w:lang w:bidi="th-TH"/>
+        </w:rPr>
+        <w:t>ื่</w:t>
       </w:r>
       <w:proofErr w:type="spellEnd"/>
       <w:r>
         <w:rPr>
-          <w:rFonts w:ascii="TH Sarabun New" w:hAnsi="TH Sarabun New" w:cs="TH Sarabun New"/>
-          <w:sz w:val="32"/>
-          <w:szCs w:val="32"/>
-          <w:cs/>
-          <w:lang w:bidi="th-TH"/>
-        </w:rPr>
-        <w:t xml:space="preserve"> (</w:t>
-      </w:r>
-      <w:r>
-        <w:rPr>
-          <w:rFonts w:ascii="TH Sarabun New" w:hAnsi="TH Sarabun New" w:cs="TH Sarabun New"/>
-          <w:sz w:val="32"/>
-          <w:szCs w:val="32"/>
-          <w:lang w:bidi="th-TH"/>
-        </w:rPr>
-        <w:t xml:space="preserve">Server) </w:t>
-      </w:r>
-      <w:r>
-        <w:rPr>
-          <w:rFonts w:ascii="TH Sarabun New" w:hAnsi="TH Sarabun New" w:cs="TH Sarabun New"/>
-          <w:sz w:val="32"/>
-          <w:szCs w:val="32"/>
-          <w:cs/>
-          <w:lang w:bidi="th-TH"/>
-        </w:rPr>
-        <w:t xml:space="preserve">ของ </w:t>
-      </w:r>
-      <w:r>
-        <w:rPr>
-          <w:rFonts w:ascii="TH Sarabun New" w:hAnsi="TH Sarabun New" w:cs="TH Sarabun New"/>
-          <w:sz w:val="32"/>
-          <w:szCs w:val="32"/>
-          <w:lang w:bidi="th-TH"/>
-        </w:rPr>
-        <w:t xml:space="preserve">Roblox </w:t>
-      </w:r>
-      <w:r>
-        <w:rPr>
-          <w:rFonts w:ascii="TH Sarabun New" w:hAnsi="TH Sarabun New" w:cs="TH Sarabun New"/>
-          <w:sz w:val="32"/>
-          <w:szCs w:val="32"/>
-          <w:cs/>
-          <w:lang w:bidi="th-TH"/>
-        </w:rPr>
-        <w:t>เพ</w:t>
+          <w:rFonts w:ascii="TH Sarabun New" w:hAnsi="TH Sarabun New"/>
+          <w:sz w:val="32"/>
+          <w:cs/>
+          <w:lang w:bidi="th-TH"/>
+        </w:rPr>
+        <w:t>ออ</w:t>
       </w:r>
       <w:proofErr w:type="spellStart"/>
       <w:r>
         <w:rPr>
-          <w:rFonts w:ascii="TH Sarabun New" w:hAnsi="TH Sarabun New" w:cs="TH Sarabun New"/>
-          <w:sz w:val="32"/>
-          <w:szCs w:val="32"/>
-          <w:cs/>
-          <w:lang w:bidi="th-TH"/>
-        </w:rPr>
-        <w:t>ื่</w:t>
+          <w:rFonts w:ascii="TH Sarabun New" w:hAnsi="TH Sarabun New"/>
+          <w:sz w:val="32"/>
+          <w:cs/>
+          <w:lang w:bidi="th-TH"/>
+        </w:rPr>
+        <w:t>ัป</w:t>
       </w:r>
       <w:proofErr w:type="spellEnd"/>
       <w:r>
         <w:rPr>
-          <w:rFonts w:ascii="TH Sarabun New" w:hAnsi="TH Sarabun New" w:cs="TH Sarabun New"/>
-          <w:sz w:val="32"/>
-          <w:szCs w:val="32"/>
-          <w:cs/>
-          <w:lang w:bidi="th-TH"/>
-        </w:rPr>
-        <w:t>ออ</w:t>
-      </w:r>
-      <w:proofErr w:type="spellStart"/>
-      <w:r>
-        <w:rPr>
-          <w:rFonts w:ascii="TH Sarabun New" w:hAnsi="TH Sarabun New" w:cs="TH Sarabun New"/>
-          <w:sz w:val="32"/>
-          <w:szCs w:val="32"/>
-          <w:cs/>
-          <w:lang w:bidi="th-TH"/>
-        </w:rPr>
-        <w:t>ัป</w:t>
-      </w:r>
-      <w:proofErr w:type="spellEnd"/>
-      <w:r>
-        <w:rPr>
-          <w:rFonts w:ascii="TH Sarabun New" w:hAnsi="TH Sarabun New" w:cs="TH Sarabun New"/>
-          <w:sz w:val="32"/>
-          <w:szCs w:val="32"/>
+          <w:rFonts w:ascii="TH Sarabun New" w:hAnsi="TH Sarabun New"/>
+          <w:sz w:val="32"/>
           <w:cs/>
           <w:lang w:bidi="th-TH"/>
         </w:rPr>
@@ -2246,6 +2243,8 @@
           <w:ilvl w:val="0"/>
           <w:numId w:val="6"/>
         </w:numPr>
+        <w:spacing w:after="0" w:line="240" w:lineRule="auto"/>
+        <w:ind w:hanging="284"/>
         <w:rPr>
           <w:rFonts w:ascii="TH Sarabun New" w:hAnsi="TH Sarabun New" w:cs="TH Sarabun New"/>
           <w:sz w:val="32"/>
@@ -2257,6 +2256,10 @@
         <w:rPr>
           <w:rStyle w:val="StrongEmphasis"/>
           <w:rFonts w:ascii="TH Sarabun New" w:hAnsi="TH Sarabun New" w:cs="TH Sarabun New"/>
+          <w:b w:val="0"/>
+          <w:bCs w:val="0"/>
+          <w:sz w:val="32"/>
+          <w:szCs w:val="32"/>
           <w:lang w:bidi="th-TH"/>
         </w:rPr>
         <w:t>Data Model:</w:t>
@@ -2307,6 +2310,8 @@
           <w:ilvl w:val="0"/>
           <w:numId w:val="6"/>
         </w:numPr>
+        <w:spacing w:after="0" w:line="240" w:lineRule="auto"/>
+        <w:ind w:hanging="284"/>
         <w:rPr>
           <w:rFonts w:ascii="TH Sarabun New" w:hAnsi="TH Sarabun New" w:cs="TH Sarabun New"/>
           <w:sz w:val="32"/>
@@ -2318,6 +2323,10 @@
         <w:rPr>
           <w:rStyle w:val="StrongEmphasis"/>
           <w:rFonts w:ascii="TH Sarabun New" w:hAnsi="TH Sarabun New" w:cs="TH Sarabun New"/>
+          <w:b w:val="0"/>
+          <w:bCs w:val="0"/>
+          <w:sz w:val="32"/>
+          <w:szCs w:val="32"/>
           <w:lang w:bidi="th-TH"/>
         </w:rPr>
         <w:t>Replication:</w:t>
@@ -2387,6 +2396,8 @@
           <w:ilvl w:val="0"/>
           <w:numId w:val="6"/>
         </w:numPr>
+        <w:spacing w:after="0" w:line="240" w:lineRule="auto"/>
+        <w:ind w:hanging="284"/>
         <w:rPr>
           <w:rFonts w:ascii="TH Sarabun New" w:hAnsi="TH Sarabun New" w:cs="TH Sarabun New"/>
           <w:sz w:val="32"/>
@@ -2398,9 +2409,12 @@
         <w:rPr>
           <w:rStyle w:val="StrongEmphasis"/>
           <w:rFonts w:ascii="TH Sarabun New" w:hAnsi="TH Sarabun New" w:cs="TH Sarabun New"/>
-          <w:lang w:bidi="th-TH"/>
-        </w:rPr>
-        <w:lastRenderedPageBreak/>
+          <w:b w:val="0"/>
+          <w:bCs w:val="0"/>
+          <w:sz w:val="32"/>
+          <w:szCs w:val="32"/>
+          <w:lang w:bidi="th-TH"/>
+        </w:rPr>
         <w:t>Remote Events/Functions:</w:t>
       </w:r>
       <w:r>
@@ -2463,129 +2477,135 @@
     </w:p>
     <w:p>
       <w:pPr>
-        <w:pStyle w:val="Textbody"/>
-        <w:rPr>
-          <w:rFonts w:ascii="TH Sarabun New" w:hAnsi="TH Sarabun New" w:cs="TH Sarabun New"/>
-          <w:sz w:val="32"/>
-          <w:szCs w:val="32"/>
-          <w:lang w:bidi="th-TH"/>
-        </w:rPr>
-      </w:pPr>
-    </w:p>
-    <w:p>
-      <w:pPr>
-        <w:pStyle w:val="Textbody"/>
-        <w:rPr>
-          <w:rFonts w:ascii="TH Sarabun New" w:hAnsi="TH Sarabun New" w:cs="TH Sarabun New"/>
-          <w:sz w:val="32"/>
-          <w:szCs w:val="32"/>
-          <w:lang w:bidi="th-TH"/>
-        </w:rPr>
-      </w:pPr>
+        <w:pStyle w:val="Heading3"/>
+        <w:rPr>
+          <w:lang w:bidi="th-TH"/>
+        </w:rPr>
+      </w:pPr>
+    </w:p>
+    <w:p>
+      <w:pPr>
+        <w:pStyle w:val="ListParagraph"/>
+        <w:numPr>
+          <w:ilvl w:val="1"/>
+          <w:numId w:val="29"/>
+        </w:numPr>
+        <w:rPr>
+          <w:rFonts w:ascii="TH Sarabun New" w:hAnsi="TH Sarabun New" w:cs="TH Sarabun New"/>
+          <w:sz w:val="32"/>
+          <w:szCs w:val="32"/>
+          <w:lang w:bidi="th-TH"/>
+        </w:rPr>
+      </w:pPr>
+      <w:r>
+        <w:rPr>
+          <w:rFonts w:ascii="TH Sarabun New" w:hAnsi="TH Sarabun New" w:cs="TH Sarabun New"/>
+          <w:sz w:val="32"/>
+          <w:szCs w:val="32"/>
+          <w:cs/>
+        </w:rPr>
+        <w:t xml:space="preserve">การพัฒนาด้วย </w:t>
+      </w:r>
+      <w:r>
+        <w:rPr>
+          <w:rFonts w:ascii="TH Sarabun New" w:hAnsi="TH Sarabun New" w:cs="TH Sarabun New"/>
+          <w:sz w:val="32"/>
+          <w:szCs w:val="32"/>
+        </w:rPr>
+        <w:t xml:space="preserve">Roblox Studio </w:t>
+      </w:r>
+      <w:r>
+        <w:rPr>
+          <w:rFonts w:ascii="TH Sarabun New" w:hAnsi="TH Sarabun New" w:cs="TH Sarabun New"/>
+          <w:sz w:val="32"/>
+          <w:szCs w:val="32"/>
+          <w:cs/>
+        </w:rPr>
+        <w:t xml:space="preserve">และภาษา </w:t>
+      </w:r>
+      <w:r>
+        <w:rPr>
+          <w:rFonts w:ascii="TH Sarabun New" w:hAnsi="TH Sarabun New" w:cs="TH Sarabun New"/>
+          <w:sz w:val="32"/>
+          <w:szCs w:val="32"/>
+        </w:rPr>
+        <w:t>Luau</w:t>
+      </w:r>
+    </w:p>
+    <w:p>
+      <w:pPr>
+        <w:pStyle w:val="ListParagraph"/>
+        <w:ind w:left="709"/>
+        <w:rPr>
+          <w:rFonts w:ascii="TH Sarabun New" w:hAnsi="TH Sarabun New" w:cs="TH Sarabun New"/>
+          <w:sz w:val="32"/>
+          <w:szCs w:val="32"/>
+          <w:lang w:bidi="th-TH"/>
+        </w:rPr>
+      </w:pPr>
+      <w:r>
+        <w:rPr>
+          <w:rFonts w:ascii="TH Sarabun New" w:hAnsi="TH Sarabun New" w:cs="TH Sarabun New"/>
+          <w:sz w:val="32"/>
+          <w:szCs w:val="32"/>
+          <w:lang w:bidi="th-TH"/>
+        </w:rPr>
+        <w:t xml:space="preserve">Roblox Studio </w:t>
+      </w:r>
+      <w:r>
+        <w:rPr>
+          <w:rFonts w:ascii="TH Sarabun New" w:hAnsi="TH Sarabun New" w:cs="TH Sarabun New"/>
+          <w:sz w:val="32"/>
+          <w:szCs w:val="32"/>
+          <w:cs/>
+          <w:lang w:bidi="th-TH"/>
+        </w:rPr>
+        <w:t xml:space="preserve">คือ </w:t>
+      </w:r>
+      <w:r>
+        <w:rPr>
+          <w:rFonts w:ascii="TH Sarabun New" w:hAnsi="TH Sarabun New" w:cs="TH Sarabun New"/>
+          <w:sz w:val="32"/>
+          <w:szCs w:val="32"/>
+          <w:lang w:bidi="th-TH"/>
+        </w:rPr>
+        <w:t xml:space="preserve">Integrated Development Environment (IDE) </w:t>
+      </w:r>
+      <w:r>
+        <w:rPr>
+          <w:rFonts w:ascii="TH Sarabun New" w:hAnsi="TH Sarabun New" w:cs="TH Sarabun New"/>
+          <w:sz w:val="32"/>
+          <w:szCs w:val="32"/>
+          <w:cs/>
+          <w:lang w:bidi="th-TH"/>
+        </w:rPr>
+        <w:t xml:space="preserve">เครื่องมือหลักที่ใช้ในการสร้างสภาพแวดล้อม วัตถุ </w:t>
+      </w:r>
+      <w:r>
+        <w:rPr>
+          <w:rFonts w:ascii="TH Sarabun New" w:hAnsi="TH Sarabun New" w:cs="TH Sarabun New"/>
+          <w:sz w:val="32"/>
+          <w:szCs w:val="32"/>
+          <w:lang w:bidi="th-TH"/>
+        </w:rPr>
+        <w:t>3</w:t>
+      </w:r>
+      <w:r>
+        <w:rPr>
+          <w:rFonts w:ascii="TH Sarabun New" w:hAnsi="TH Sarabun New" w:cs="TH Sarabun New"/>
+          <w:sz w:val="32"/>
+          <w:szCs w:val="32"/>
+          <w:cs/>
+          <w:lang w:bidi="th-TH"/>
+        </w:rPr>
+        <w:t xml:space="preserve"> มิติ และเขียนโปรแกรมควบคุม การทำงานทั้งหมดถูกควบคุมด้วยภาษา </w:t>
+      </w:r>
       <w:r>
         <w:rPr>
           <w:rStyle w:val="StrongEmphasis"/>
           <w:rFonts w:ascii="TH Sarabun New" w:hAnsi="TH Sarabun New" w:cs="TH Sarabun New"/>
-          <w:lang w:bidi="th-TH"/>
-        </w:rPr>
-        <w:t>1.2</w:t>
-      </w:r>
-      <w:r>
-        <w:rPr>
-          <w:rStyle w:val="StrongEmphasis"/>
-          <w:rFonts w:ascii="TH Sarabun New" w:hAnsi="TH Sarabun New" w:cs="TH Sarabun New"/>
-          <w:cs/>
-          <w:lang w:bidi="th-TH"/>
-        </w:rPr>
-        <w:t xml:space="preserve"> การพัฒนาด้วย </w:t>
-      </w:r>
-      <w:r>
-        <w:rPr>
-          <w:rStyle w:val="StrongEmphasis"/>
-          <w:rFonts w:ascii="TH Sarabun New" w:hAnsi="TH Sarabun New" w:cs="TH Sarabun New"/>
-          <w:lang w:bidi="th-TH"/>
-        </w:rPr>
-        <w:t xml:space="preserve">Roblox Studio </w:t>
-      </w:r>
-      <w:r>
-        <w:rPr>
-          <w:rStyle w:val="StrongEmphasis"/>
-          <w:rFonts w:ascii="TH Sarabun New" w:hAnsi="TH Sarabun New" w:cs="TH Sarabun New"/>
-          <w:cs/>
-          <w:lang w:bidi="th-TH"/>
-        </w:rPr>
-        <w:t xml:space="preserve">และภาษา </w:t>
-      </w:r>
-      <w:r>
-        <w:rPr>
-          <w:rStyle w:val="StrongEmphasis"/>
-          <w:rFonts w:ascii="TH Sarabun New" w:hAnsi="TH Sarabun New" w:cs="TH Sarabun New"/>
-          <w:lang w:bidi="th-TH"/>
-        </w:rPr>
-        <w:t>Luau</w:t>
-      </w:r>
-      <w:r>
-        <w:rPr>
-          <w:rFonts w:ascii="TH Sarabun New" w:hAnsi="TH Sarabun New" w:cs="TH Sarabun New"/>
-          <w:sz w:val="32"/>
-          <w:szCs w:val="32"/>
-          <w:lang w:bidi="th-TH"/>
-        </w:rPr>
-        <w:br/>
-        <w:t xml:space="preserve">Roblox Studio </w:t>
-      </w:r>
-      <w:r>
-        <w:rPr>
-          <w:rFonts w:ascii="TH Sarabun New" w:hAnsi="TH Sarabun New" w:cs="TH Sarabun New"/>
-          <w:sz w:val="32"/>
-          <w:szCs w:val="32"/>
-          <w:cs/>
-          <w:lang w:bidi="th-TH"/>
-        </w:rPr>
-        <w:t xml:space="preserve">คือ </w:t>
-      </w:r>
-      <w:r>
-        <w:rPr>
-          <w:rFonts w:ascii="TH Sarabun New" w:hAnsi="TH Sarabun New" w:cs="TH Sarabun New"/>
-          <w:sz w:val="32"/>
-          <w:szCs w:val="32"/>
-          <w:lang w:bidi="th-TH"/>
-        </w:rPr>
-        <w:t xml:space="preserve">Integrated Development Environment (IDE) </w:t>
-      </w:r>
-      <w:r>
-        <w:rPr>
-          <w:rFonts w:ascii="TH Sarabun New" w:hAnsi="TH Sarabun New" w:cs="TH Sarabun New"/>
-          <w:sz w:val="32"/>
-          <w:szCs w:val="32"/>
-          <w:cs/>
-          <w:lang w:bidi="th-TH"/>
-        </w:rPr>
-        <w:t xml:space="preserve">เครื่องมือหลักที่ใช้ในการสร้างสภาพแวดล้อม วัตถุ </w:t>
-      </w:r>
-      <w:r>
-        <w:rPr>
-          <w:rFonts w:ascii="TH Sarabun New" w:hAnsi="TH Sarabun New" w:cs="TH Sarabun New"/>
-          <w:sz w:val="32"/>
-          <w:szCs w:val="32"/>
-          <w:lang w:bidi="th-TH"/>
-        </w:rPr>
-        <w:t>3</w:t>
-      </w:r>
-      <w:r>
-        <w:rPr>
-          <w:rFonts w:ascii="TH Sarabun New" w:hAnsi="TH Sarabun New" w:cs="TH Sarabun New"/>
-          <w:sz w:val="32"/>
-          <w:szCs w:val="32"/>
-          <w:cs/>
-          <w:lang w:bidi="th-TH"/>
-        </w:rPr>
-        <w:t xml:space="preserve"> มิติ และเขียนโปรแกรมควบคุม การทำงานทั้งหมดถูกควบคุมด้วยภาษา </w:t>
-      </w:r>
-      <w:r>
-        <w:rPr>
-          <w:rStyle w:val="StrongEmphasis"/>
-          <w:rFonts w:ascii="TH Sarabun New" w:hAnsi="TH Sarabun New" w:cs="TH Sarabun New"/>
+          <w:sz w:val="32"/>
+          <w:szCs w:val="32"/>
           <w:lang w:bidi="th-TH"/>
         </w:rPr>
         <w:t>Luau</w:t>
@@ -2682,6 +2702,7 @@
           <w:cs/>
           <w:lang w:bidi="th-TH"/>
         </w:rPr>
+        <w:lastRenderedPageBreak/>
         <w:t xml:space="preserve">ระบบ </w:t>
       </w:r>
       <w:r>
@@ -2795,39 +2816,148 @@
     </w:p>
     <w:p>
       <w:pPr>
+        <w:pStyle w:val="Heading2"/>
+        <w:rPr>
+          <w:sz w:val="32"/>
+          <w:lang w:bidi="th-TH"/>
+        </w:rPr>
+      </w:pPr>
+      <w:r>
+        <w:rPr>
+          <w:rStyle w:val="StrongEmphasis"/>
+          <w:rFonts w:ascii="TH Sarabun New" w:hAnsi="TH Sarabun New"/>
+          <w:cs/>
+          <w:lang w:bidi="th-TH"/>
+        </w:rPr>
+        <w:t>ทฤษฎีการสื่อสารภาษาอังกฤษ (</w:t>
+      </w:r>
+      <w:r>
+        <w:rPr>
+          <w:rStyle w:val="StrongEmphasis"/>
+          <w:rFonts w:ascii="TH Sarabun New" w:hAnsi="TH Sarabun New"/>
+          <w:lang w:bidi="th-TH"/>
+        </w:rPr>
+        <w:t>English Communication Theory)</w:t>
+      </w:r>
+    </w:p>
+    <w:p>
+      <w:pPr>
         <w:pStyle w:val="Heading4"/>
-        <w:spacing w:before="0" w:after="140" w:line="276" w:lineRule="auto"/>
-        <w:rPr>
-          <w:rFonts w:ascii="TH Sarabun New" w:hAnsi="TH Sarabun New" w:cs="TH Sarabun New"/>
-          <w:sz w:val="32"/>
-          <w:szCs w:val="32"/>
-          <w:lang w:bidi="th-TH"/>
-        </w:rPr>
-      </w:pPr>
-      <w:r>
-        <w:rPr>
-          <w:rStyle w:val="StrongEmphasis"/>
-          <w:rFonts w:ascii="TH Sarabun New" w:hAnsi="TH Sarabun New" w:cs="TH Sarabun New"/>
-          <w:lang w:bidi="th-TH"/>
-        </w:rPr>
-        <w:t xml:space="preserve">2. </w:t>
-      </w:r>
-      <w:r>
-        <w:rPr>
-          <w:rStyle w:val="StrongEmphasis"/>
-          <w:rFonts w:ascii="TH Sarabun New" w:hAnsi="TH Sarabun New" w:cs="TH Sarabun New"/>
-          <w:cs/>
-          <w:lang w:bidi="th-TH"/>
-        </w:rPr>
-        <w:t>ทฤษฎีการสื่อสารภาษาอังกฤษ (</w:t>
-      </w:r>
-      <w:r>
-        <w:rPr>
-          <w:rStyle w:val="StrongEmphasis"/>
-          <w:rFonts w:ascii="TH Sarabun New" w:hAnsi="TH Sarabun New" w:cs="TH Sarabun New"/>
-          <w:lang w:bidi="th-TH"/>
-        </w:rPr>
-        <w:t>English Communication Theory)</w:t>
+        <w:rPr>
+          <w:rStyle w:val="Heading3Char"/>
+          <w:rFonts w:ascii="TH Sarabun New" w:hAnsi="TH Sarabun New"/>
+          <w:sz w:val="32"/>
+        </w:rPr>
+      </w:pPr>
+      <w:r>
+        <w:rPr>
+          <w:rStyle w:val="Heading3Char"/>
+          <w:rFonts w:ascii="TH Sarabun New" w:hAnsi="TH Sarabun New"/>
+          <w:sz w:val="32"/>
+        </w:rPr>
+        <w:t>2.1</w:t>
+      </w:r>
+      <w:r>
+        <w:rPr>
+          <w:rStyle w:val="Heading3Char"/>
+          <w:rFonts w:ascii="TH Sarabun New" w:hAnsi="TH Sarabun New"/>
+          <w:sz w:val="32"/>
+          <w:cs/>
+        </w:rPr>
+        <w:t xml:space="preserve"> แนวคิดการสอนภาษาเพื่อการสื่อสาร (</w:t>
+      </w:r>
+      <w:r>
+        <w:rPr>
+          <w:rStyle w:val="Heading3Char"/>
+          <w:rFonts w:ascii="TH Sarabun New" w:hAnsi="TH Sarabun New"/>
+          <w:sz w:val="32"/>
+        </w:rPr>
+        <w:t>Communicative Language Teaching - CLT)</w:t>
+      </w:r>
+    </w:p>
+    <w:p>
+      <w:pPr>
+        <w:jc w:val="thaiDistribute"/>
+        <w:rPr>
+          <w:rFonts w:ascii="TH Sarabun New" w:eastAsiaTheme="majorEastAsia" w:hAnsi="TH Sarabun New"/>
+          <w:sz w:val="32"/>
+        </w:rPr>
+      </w:pPr>
+      <w:r>
+        <w:rPr>
+          <w:rStyle w:val="Heading3Char"/>
+          <w:rFonts w:ascii="TH Sarabun New" w:hAnsi="TH Sarabun New"/>
+          <w:sz w:val="32"/>
+        </w:rPr>
+        <w:br/>
+      </w:r>
+      <w:r>
+        <w:rPr>
+          <w:rFonts w:ascii="TH Sarabun New" w:hAnsi="TH Sarabun New"/>
+          <w:sz w:val="32"/>
+          <w:cs/>
+        </w:rPr>
+        <w:t xml:space="preserve">โครงงานนี้ยึดหลักการ </w:t>
+      </w:r>
+      <w:r>
+        <w:rPr>
+          <w:rFonts w:ascii="TH Sarabun New" w:hAnsi="TH Sarabun New"/>
+          <w:sz w:val="32"/>
+        </w:rPr>
+        <w:t xml:space="preserve">CLT </w:t>
+      </w:r>
+      <w:r>
+        <w:rPr>
+          <w:rFonts w:ascii="TH Sarabun New" w:hAnsi="TH Sarabun New"/>
+          <w:sz w:val="32"/>
+          <w:cs/>
+        </w:rPr>
+        <w:t>ที่เน้นให้ผู้เรียนได้ใช้ภาษาในสถานการณ์จริง (</w:t>
+      </w:r>
+      <w:r>
+        <w:rPr>
+          <w:rFonts w:ascii="TH Sarabun New" w:hAnsi="TH Sarabun New"/>
+          <w:sz w:val="32"/>
+        </w:rPr>
+        <w:t xml:space="preserve">Authentic Situations) </w:t>
+      </w:r>
+      <w:r>
+        <w:rPr>
+          <w:rFonts w:ascii="TH Sarabun New" w:hAnsi="TH Sarabun New"/>
+          <w:sz w:val="32"/>
+          <w:cs/>
+        </w:rPr>
+        <w:t>มากกว่าการท่องจำไวยากรณ์เพียงอย่างเดียว โดยจำลองบริบทภายในเกมให้ผู้เล่นต้องทำความเข้าใจสาร (</w:t>
+      </w:r>
+      <w:r>
+        <w:rPr>
+          <w:rFonts w:ascii="TH Sarabun New" w:hAnsi="TH Sarabun New"/>
+          <w:sz w:val="32"/>
+        </w:rPr>
+        <w:t xml:space="preserve">Input) </w:t>
+      </w:r>
+      <w:r>
+        <w:rPr>
+          <w:rFonts w:ascii="TH Sarabun New" w:hAnsi="TH Sarabun New"/>
+          <w:sz w:val="32"/>
+          <w:cs/>
+        </w:rPr>
+        <w:t>และสื่อสารตอบโต้ (</w:t>
+      </w:r>
+      <w:r>
+        <w:rPr>
+          <w:rFonts w:ascii="TH Sarabun New" w:hAnsi="TH Sarabun New"/>
+          <w:sz w:val="32"/>
+        </w:rPr>
+        <w:t xml:space="preserve">Output) </w:t>
+      </w:r>
+      <w:r>
+        <w:rPr>
+          <w:rFonts w:ascii="TH Sarabun New" w:hAnsi="TH Sarabun New"/>
+          <w:sz w:val="32"/>
+          <w:cs/>
+        </w:rPr>
+        <w:t>เพื่อให้บรรลุเป้าหมายของภารกิจ</w:t>
       </w:r>
     </w:p>
     <w:p>
@@ -2842,166 +2972,34 @@
       </w:pPr>
       <w:r>
         <w:rPr>
-          <w:rStyle w:val="StrongEmphasis"/>
-          <w:rFonts w:ascii="TH Sarabun New" w:hAnsi="TH Sarabun New" w:cs="TH Sarabun New"/>
-          <w:lang w:bidi="th-TH"/>
-        </w:rPr>
-        <w:t>2.1</w:t>
-      </w:r>
-      <w:r>
-        <w:rPr>
-          <w:rStyle w:val="StrongEmphasis"/>
-          <w:rFonts w:ascii="TH Sarabun New" w:hAnsi="TH Sarabun New" w:cs="TH Sarabun New"/>
-          <w:cs/>
-          <w:lang w:bidi="th-TH"/>
-        </w:rPr>
-        <w:t xml:space="preserve"> แนวคิดการสอนภาษาเพื่อการสื่อสาร (</w:t>
-      </w:r>
-      <w:r>
-        <w:rPr>
-          <w:rStyle w:val="StrongEmphasis"/>
-          <w:rFonts w:ascii="TH Sarabun New" w:hAnsi="TH Sarabun New" w:cs="TH Sarabun New"/>
-          <w:lang w:bidi="th-TH"/>
-        </w:rPr>
-        <w:t>Communicative Language Teaching - CLT)</w:t>
-      </w:r>
-      <w:r>
-        <w:rPr>
-          <w:rFonts w:ascii="TH Sarabun New" w:hAnsi="TH Sarabun New" w:cs="TH Sarabun New"/>
-          <w:sz w:val="32"/>
-          <w:szCs w:val="32"/>
-          <w:lang w:bidi="th-TH"/>
-        </w:rPr>
-        <w:br/>
-      </w:r>
-      <w:r>
-        <w:rPr>
-          <w:rFonts w:ascii="TH Sarabun New" w:hAnsi="TH Sarabun New" w:cs="TH Sarabun New"/>
-          <w:sz w:val="32"/>
-          <w:szCs w:val="32"/>
-          <w:cs/>
-          <w:lang w:bidi="th-TH"/>
-        </w:rPr>
-        <w:t xml:space="preserve">โครงงานนี้ยึดหลักการ </w:t>
-      </w:r>
-      <w:r>
-        <w:rPr>
-          <w:rFonts w:ascii="TH Sarabun New" w:hAnsi="TH Sarabun New" w:cs="TH Sarabun New"/>
-          <w:sz w:val="32"/>
-          <w:szCs w:val="32"/>
-          <w:lang w:bidi="th-TH"/>
-        </w:rPr>
-        <w:t xml:space="preserve">CLT </w:t>
-      </w:r>
-      <w:r>
-        <w:rPr>
-          <w:rFonts w:ascii="TH Sarabun New" w:hAnsi="TH Sarabun New" w:cs="TH Sarabun New"/>
-          <w:sz w:val="32"/>
-          <w:szCs w:val="32"/>
-          <w:cs/>
-          <w:lang w:bidi="th-TH"/>
-        </w:rPr>
-        <w:t>ที่เน้นให้ผู้เรียนได้ใช้ภาษาในสถานการณ์จริง (</w:t>
-      </w:r>
-      <w:r>
-        <w:rPr>
-          <w:rFonts w:ascii="TH Sarabun New" w:hAnsi="TH Sarabun New" w:cs="TH Sarabun New"/>
-          <w:sz w:val="32"/>
-          <w:szCs w:val="32"/>
-          <w:lang w:bidi="th-TH"/>
-        </w:rPr>
-        <w:t xml:space="preserve">Authentic Situations) </w:t>
-      </w:r>
-      <w:r>
-        <w:rPr>
-          <w:rFonts w:ascii="TH Sarabun New" w:hAnsi="TH Sarabun New" w:cs="TH Sarabun New"/>
-          <w:sz w:val="32"/>
-          <w:szCs w:val="32"/>
-          <w:cs/>
-          <w:lang w:bidi="th-TH"/>
-        </w:rPr>
-        <w:t>มากกว่าการท่องจำไวยากรณ์เพียงอย่างเดียว โดยจำลองบริบทภายในเกมให้ผู้เล่นต้องทำความเข้าใจสาร (</w:t>
-      </w:r>
-      <w:r>
-        <w:rPr>
-          <w:rFonts w:ascii="TH Sarabun New" w:hAnsi="TH Sarabun New" w:cs="TH Sarabun New"/>
-          <w:sz w:val="32"/>
-          <w:szCs w:val="32"/>
-          <w:lang w:bidi="th-TH"/>
-        </w:rPr>
-        <w:t xml:space="preserve">Input) </w:t>
-      </w:r>
-      <w:r>
-        <w:rPr>
-          <w:rFonts w:ascii="TH Sarabun New" w:hAnsi="TH Sarabun New" w:cs="TH Sarabun New"/>
-          <w:sz w:val="32"/>
-          <w:szCs w:val="32"/>
-          <w:cs/>
-          <w:lang w:bidi="th-TH"/>
-        </w:rPr>
-        <w:t>และสื่อสารตอบโต้ (</w:t>
-      </w:r>
-      <w:r>
-        <w:rPr>
-          <w:rFonts w:ascii="TH Sarabun New" w:hAnsi="TH Sarabun New" w:cs="TH Sarabun New"/>
-          <w:sz w:val="32"/>
-          <w:szCs w:val="32"/>
-          <w:lang w:bidi="th-TH"/>
-        </w:rPr>
-        <w:t xml:space="preserve">Output) </w:t>
-      </w:r>
-      <w:r>
-        <w:rPr>
-          <w:rFonts w:ascii="TH Sarabun New" w:hAnsi="TH Sarabun New" w:cs="TH Sarabun New"/>
-          <w:sz w:val="32"/>
-          <w:szCs w:val="32"/>
-          <w:cs/>
-          <w:lang w:bidi="th-TH"/>
-        </w:rPr>
-        <w:t>เพื่อให้บรรลุเป้าหมายของภารกิจ</w:t>
-      </w:r>
-    </w:p>
-    <w:p>
-      <w:pPr>
-        <w:pStyle w:val="Textbody"/>
-        <w:rPr>
-          <w:rFonts w:ascii="TH Sarabun New" w:hAnsi="TH Sarabun New" w:cs="TH Sarabun New"/>
-          <w:sz w:val="32"/>
-          <w:szCs w:val="32"/>
-          <w:lang w:bidi="th-TH"/>
-        </w:rPr>
-      </w:pPr>
-      <w:r>
-        <w:rPr>
-          <w:rStyle w:val="StrongEmphasis"/>
-          <w:rFonts w:ascii="TH Sarabun New" w:hAnsi="TH Sarabun New" w:cs="TH Sarabun New"/>
-          <w:lang w:bidi="th-TH"/>
+          <w:rStyle w:val="Heading3Char"/>
+          <w:rFonts w:ascii="TH Sarabun New" w:hAnsi="TH Sarabun New"/>
+          <w:sz w:val="32"/>
         </w:rPr>
         <w:t>2.2</w:t>
       </w:r>
       <w:r>
         <w:rPr>
-          <w:rStyle w:val="StrongEmphasis"/>
-          <w:rFonts w:ascii="TH Sarabun New" w:hAnsi="TH Sarabun New" w:cs="TH Sarabun New"/>
-          <w:cs/>
-          <w:lang w:bidi="th-TH"/>
+          <w:rStyle w:val="Heading3Char"/>
+          <w:rFonts w:ascii="TH Sarabun New" w:hAnsi="TH Sarabun New"/>
+          <w:sz w:val="32"/>
+          <w:cs/>
         </w:rPr>
         <w:t xml:space="preserve"> ทักษะทางภาษาที่เน้นในบริบทเกม (</w:t>
       </w:r>
       <w:r>
         <w:rPr>
-          <w:rStyle w:val="StrongEmphasis"/>
-          <w:rFonts w:ascii="TH Sarabun New" w:hAnsi="TH Sarabun New" w:cs="TH Sarabun New"/>
-          <w:lang w:bidi="th-TH"/>
+          <w:rStyle w:val="Heading3Char"/>
+          <w:rFonts w:ascii="TH Sarabun New" w:hAnsi="TH Sarabun New"/>
+          <w:sz w:val="32"/>
         </w:rPr>
         <w:t>Targeted Skills)</w:t>
       </w:r>
       <w:r>
         <w:rPr>
-          <w:rFonts w:ascii="TH Sarabun New" w:hAnsi="TH Sarabun New" w:cs="TH Sarabun New"/>
-          <w:sz w:val="32"/>
-          <w:szCs w:val="32"/>
-          <w:lang w:bidi="th-TH"/>
+          <w:rStyle w:val="Heading3Char"/>
+          <w:rFonts w:ascii="TH Sarabun New" w:hAnsi="TH Sarabun New"/>
+          <w:sz w:val="32"/>
         </w:rPr>
         <w:br/>
       </w:r>
@@ -3053,6 +3051,8 @@
         <w:rPr>
           <w:rStyle w:val="StrongEmphasis"/>
           <w:rFonts w:ascii="TH Sarabun New" w:hAnsi="TH Sarabun New" w:cs="TH Sarabun New"/>
+          <w:sz w:val="32"/>
+          <w:szCs w:val="32"/>
           <w:cs/>
           <w:lang w:bidi="th-TH"/>
         </w:rPr>
@@ -3062,6 +3062,8 @@
         <w:rPr>
           <w:rStyle w:val="StrongEmphasis"/>
           <w:rFonts w:ascii="TH Sarabun New" w:hAnsi="TH Sarabun New" w:cs="TH Sarabun New"/>
+          <w:sz w:val="32"/>
+          <w:szCs w:val="32"/>
           <w:lang w:bidi="th-TH"/>
         </w:rPr>
         <w:t>Reading):</w:t>
@@ -3123,6 +3125,8 @@
         <w:rPr>
           <w:rStyle w:val="StrongEmphasis"/>
           <w:rFonts w:ascii="TH Sarabun New" w:hAnsi="TH Sarabun New" w:cs="TH Sarabun New"/>
+          <w:sz w:val="32"/>
+          <w:szCs w:val="32"/>
           <w:cs/>
           <w:lang w:bidi="th-TH"/>
         </w:rPr>
@@ -3132,6 +3136,8 @@
         <w:rPr>
           <w:rStyle w:val="StrongEmphasis"/>
           <w:rFonts w:ascii="TH Sarabun New" w:hAnsi="TH Sarabun New" w:cs="TH Sarabun New"/>
+          <w:sz w:val="32"/>
+          <w:szCs w:val="32"/>
           <w:lang w:bidi="th-TH"/>
         </w:rPr>
         <w:t>Listening):</w:t>
@@ -3193,6 +3199,8 @@
         <w:rPr>
           <w:rStyle w:val="StrongEmphasis"/>
           <w:rFonts w:ascii="TH Sarabun New" w:hAnsi="TH Sarabun New" w:cs="TH Sarabun New"/>
+          <w:sz w:val="32"/>
+          <w:szCs w:val="32"/>
           <w:cs/>
           <w:lang w:bidi="th-TH"/>
         </w:rPr>
@@ -3202,6 +3210,8 @@
         <w:rPr>
           <w:rStyle w:val="StrongEmphasis"/>
           <w:rFonts w:ascii="TH Sarabun New" w:hAnsi="TH Sarabun New" w:cs="TH Sarabun New"/>
+          <w:sz w:val="32"/>
+          <w:szCs w:val="32"/>
           <w:lang w:bidi="th-TH"/>
         </w:rPr>
         <w:t>Writing):</w:t>
@@ -3277,28 +3287,27 @@
     </w:p>
     <w:p>
       <w:pPr>
-        <w:pStyle w:val="Heading4"/>
-        <w:spacing w:before="0" w:after="140" w:line="276" w:lineRule="auto"/>
-        <w:rPr>
-          <w:rFonts w:ascii="TH Sarabun New" w:hAnsi="TH Sarabun New" w:cs="TH Sarabun New"/>
-          <w:sz w:val="32"/>
-          <w:szCs w:val="32"/>
+        <w:pStyle w:val="Heading2"/>
+        <w:rPr>
+          <w:rFonts w:ascii="TH Sarabun New" w:hAnsi="TH Sarabun New"/>
+          <w:sz w:val="32"/>
           <w:lang w:bidi="th-TH"/>
         </w:rPr>
       </w:pPr>
       <w:r>
         <w:rPr>
           <w:rStyle w:val="StrongEmphasis"/>
-          <w:rFonts w:ascii="TH Sarabun New" w:hAnsi="TH Sarabun New" w:cs="TH Sarabun New"/>
-          <w:lang w:bidi="th-TH"/>
-        </w:rPr>
-        <w:lastRenderedPageBreak/>
+          <w:rFonts w:ascii="TH Sarabun New" w:hAnsi="TH Sarabun New"/>
+          <w:sz w:val="32"/>
+          <w:lang w:bidi="th-TH"/>
+        </w:rPr>
         <w:t xml:space="preserve">3. </w:t>
       </w:r>
       <w:r>
         <w:rPr>
           <w:rStyle w:val="StrongEmphasis"/>
-          <w:rFonts w:ascii="TH Sarabun New" w:hAnsi="TH Sarabun New" w:cs="TH Sarabun New"/>
+          <w:rFonts w:ascii="TH Sarabun New" w:hAnsi="TH Sarabun New"/>
+          <w:sz w:val="32"/>
           <w:cs/>
           <w:lang w:bidi="th-TH"/>
         </w:rPr>
@@ -3307,7 +3316,8 @@
       <w:r>
         <w:rPr>
           <w:rStyle w:val="StrongEmphasis"/>
-          <w:rFonts w:ascii="TH Sarabun New" w:hAnsi="TH Sarabun New" w:cs="TH Sarabun New"/>
+          <w:rFonts w:ascii="TH Sarabun New" w:hAnsi="TH Sarabun New"/>
+          <w:sz w:val="32"/>
           <w:lang w:bidi="th-TH"/>
         </w:rPr>
         <w:t>Game-based Learning - GBL)</w:t>
@@ -3327,6 +3337,8 @@
         <w:rPr>
           <w:rStyle w:val="StrongEmphasis"/>
           <w:rFonts w:ascii="TH Sarabun New" w:hAnsi="TH Sarabun New" w:cs="TH Sarabun New"/>
+          <w:sz w:val="32"/>
+          <w:szCs w:val="32"/>
           <w:lang w:bidi="th-TH"/>
         </w:rPr>
         <w:t>3.1</w:t>
@@ -3335,6 +3347,8 @@
         <w:rPr>
           <w:rStyle w:val="StrongEmphasis"/>
           <w:rFonts w:ascii="TH Sarabun New" w:hAnsi="TH Sarabun New" w:cs="TH Sarabun New"/>
+          <w:sz w:val="32"/>
+          <w:szCs w:val="32"/>
           <w:cs/>
           <w:lang w:bidi="th-TH"/>
         </w:rPr>
@@ -3344,6 +3358,8 @@
         <w:rPr>
           <w:rStyle w:val="StrongEmphasis"/>
           <w:rFonts w:ascii="TH Sarabun New" w:hAnsi="TH Sarabun New" w:cs="TH Sarabun New"/>
+          <w:sz w:val="32"/>
+          <w:szCs w:val="32"/>
           <w:lang w:bidi="th-TH"/>
         </w:rPr>
         <w:t>Edutainment</w:t>
@@ -3440,6 +3456,8 @@
         <w:rPr>
           <w:rStyle w:val="StrongEmphasis"/>
           <w:rFonts w:ascii="TH Sarabun New" w:hAnsi="TH Sarabun New" w:cs="TH Sarabun New"/>
+          <w:sz w:val="32"/>
+          <w:szCs w:val="32"/>
           <w:lang w:bidi="th-TH"/>
         </w:rPr>
         <w:t>3.2</w:t>
@@ -3448,6 +3466,8 @@
         <w:rPr>
           <w:rStyle w:val="StrongEmphasis"/>
           <w:rFonts w:ascii="TH Sarabun New" w:hAnsi="TH Sarabun New" w:cs="TH Sarabun New"/>
+          <w:sz w:val="32"/>
+          <w:szCs w:val="32"/>
           <w:cs/>
           <w:lang w:bidi="th-TH"/>
         </w:rPr>
@@ -3457,6 +3477,8 @@
         <w:rPr>
           <w:rStyle w:val="StrongEmphasis"/>
           <w:rFonts w:ascii="TH Sarabun New" w:hAnsi="TH Sarabun New" w:cs="TH Sarabun New"/>
+          <w:sz w:val="32"/>
+          <w:szCs w:val="32"/>
           <w:lang w:bidi="th-TH"/>
         </w:rPr>
         <w:t>Flow Theory)</w:t>
@@ -3506,7 +3528,17 @@
           <w:szCs w:val="32"/>
           <w:lang w:bidi="th-TH"/>
         </w:rPr>
-        <w:t xml:space="preserve">Mihaly Csikszentmihalyi </w:t>
+        <w:t xml:space="preserve">Mihaly </w:t>
+      </w:r>
+      <w:r>
+        <w:rPr>
+          <w:rFonts w:ascii="TH Sarabun New" w:hAnsi="TH Sarabun New" w:cs="TH Sarabun New"/>
+          <w:sz w:val="32"/>
+          <w:szCs w:val="32"/>
+          <w:lang w:bidi="th-TH"/>
+        </w:rPr>
+        <w:lastRenderedPageBreak/>
+        <w:t xml:space="preserve">Csikszentmihalyi </w:t>
       </w:r>
       <w:r>
         <w:rPr>
@@ -3614,6 +3646,8 @@
         <w:rPr>
           <w:rStyle w:val="StrongEmphasis"/>
           <w:rFonts w:ascii="TH Sarabun New" w:hAnsi="TH Sarabun New" w:cs="TH Sarabun New"/>
+          <w:sz w:val="32"/>
+          <w:szCs w:val="32"/>
           <w:cs/>
           <w:lang w:bidi="th-TH"/>
         </w:rPr>
@@ -3623,6 +3657,8 @@
         <w:rPr>
           <w:rStyle w:val="StrongEmphasis"/>
           <w:rFonts w:ascii="TH Sarabun New" w:hAnsi="TH Sarabun New" w:cs="TH Sarabun New"/>
+          <w:sz w:val="32"/>
+          <w:szCs w:val="32"/>
           <w:lang w:bidi="th-TH"/>
         </w:rPr>
         <w:t>Flow):</w:t>
@@ -3682,19 +3718,18 @@
     </w:p>
     <w:p>
       <w:pPr>
-        <w:pStyle w:val="Heading4"/>
-        <w:spacing w:before="0" w:after="140" w:line="276" w:lineRule="auto"/>
-        <w:rPr>
-          <w:rFonts w:ascii="TH Sarabun New" w:hAnsi="TH Sarabun New" w:cs="TH Sarabun New"/>
-          <w:sz w:val="32"/>
-          <w:szCs w:val="32"/>
+        <w:pStyle w:val="Heading2"/>
+        <w:rPr>
+          <w:rFonts w:ascii="TH Sarabun New" w:hAnsi="TH Sarabun New"/>
+          <w:sz w:val="32"/>
           <w:lang w:bidi="th-TH"/>
         </w:rPr>
       </w:pPr>
       <w:r>
         <w:rPr>
           <w:rStyle w:val="StrongEmphasis"/>
-          <w:rFonts w:ascii="TH Sarabun New" w:hAnsi="TH Sarabun New" w:cs="TH Sarabun New"/>
+          <w:rFonts w:ascii="TH Sarabun New" w:hAnsi="TH Sarabun New"/>
+          <w:sz w:val="32"/>
           <w:lang w:bidi="th-TH"/>
         </w:rPr>
         <w:t xml:space="preserve">4. </w:t>
@@ -3702,7 +3737,8 @@
       <w:r>
         <w:rPr>
           <w:rStyle w:val="StrongEmphasis"/>
-          <w:rFonts w:ascii="TH Sarabun New" w:hAnsi="TH Sarabun New" w:cs="TH Sarabun New"/>
+          <w:rFonts w:ascii="TH Sarabun New" w:hAnsi="TH Sarabun New"/>
+          <w:sz w:val="32"/>
           <w:cs/>
           <w:lang w:bidi="th-TH"/>
         </w:rPr>
@@ -3711,7 +3747,8 @@
       <w:r>
         <w:rPr>
           <w:rStyle w:val="StrongEmphasis"/>
-          <w:rFonts w:ascii="TH Sarabun New" w:hAnsi="TH Sarabun New" w:cs="TH Sarabun New"/>
+          <w:rFonts w:ascii="TH Sarabun New" w:hAnsi="TH Sarabun New"/>
+          <w:sz w:val="32"/>
           <w:lang w:bidi="th-TH"/>
         </w:rPr>
         <w:t>Game Design Principles)</w:t>
@@ -3731,6 +3768,8 @@
         <w:rPr>
           <w:rStyle w:val="StrongEmphasis"/>
           <w:rFonts w:ascii="TH Sarabun New" w:hAnsi="TH Sarabun New" w:cs="TH Sarabun New"/>
+          <w:sz w:val="32"/>
+          <w:szCs w:val="32"/>
           <w:lang w:bidi="th-TH"/>
         </w:rPr>
         <w:t>4.1</w:t>
@@ -3739,6 +3778,8 @@
         <w:rPr>
           <w:rStyle w:val="StrongEmphasis"/>
           <w:rFonts w:ascii="TH Sarabun New" w:hAnsi="TH Sarabun New" w:cs="TH Sarabun New"/>
+          <w:sz w:val="32"/>
+          <w:szCs w:val="32"/>
           <w:cs/>
           <w:lang w:bidi="th-TH"/>
         </w:rPr>
@@ -3748,6 +3789,8 @@
         <w:rPr>
           <w:rStyle w:val="StrongEmphasis"/>
           <w:rFonts w:ascii="TH Sarabun New" w:hAnsi="TH Sarabun New" w:cs="TH Sarabun New"/>
+          <w:sz w:val="32"/>
+          <w:szCs w:val="32"/>
           <w:lang w:bidi="th-TH"/>
         </w:rPr>
         <w:t>Core Game Loop)</w:t>
@@ -3809,6 +3852,8 @@
         <w:rPr>
           <w:rStyle w:val="StrongEmphasis"/>
           <w:rFonts w:ascii="TH Sarabun New" w:hAnsi="TH Sarabun New" w:cs="TH Sarabun New"/>
+          <w:sz w:val="32"/>
+          <w:szCs w:val="32"/>
           <w:lang w:bidi="th-TH"/>
         </w:rPr>
         <w:t>Action (</w:t>
@@ -3817,6 +3862,8 @@
         <w:rPr>
           <w:rStyle w:val="StrongEmphasis"/>
           <w:rFonts w:ascii="TH Sarabun New" w:hAnsi="TH Sarabun New" w:cs="TH Sarabun New"/>
+          <w:sz w:val="32"/>
+          <w:szCs w:val="32"/>
           <w:cs/>
           <w:lang w:bidi="th-TH"/>
         </w:rPr>
@@ -3851,6 +3898,8 @@
         <w:rPr>
           <w:rStyle w:val="StrongEmphasis"/>
           <w:rFonts w:ascii="TH Sarabun New" w:hAnsi="TH Sarabun New" w:cs="TH Sarabun New"/>
+          <w:sz w:val="32"/>
+          <w:szCs w:val="32"/>
           <w:lang w:bidi="th-TH"/>
         </w:rPr>
         <w:t>Challenge (</w:t>
@@ -3859,6 +3908,8 @@
         <w:rPr>
           <w:rStyle w:val="StrongEmphasis"/>
           <w:rFonts w:ascii="TH Sarabun New" w:hAnsi="TH Sarabun New" w:cs="TH Sarabun New"/>
+          <w:sz w:val="32"/>
+          <w:szCs w:val="32"/>
           <w:cs/>
           <w:lang w:bidi="th-TH"/>
         </w:rPr>
@@ -3893,6 +3944,8 @@
         <w:rPr>
           <w:rStyle w:val="StrongEmphasis"/>
           <w:rFonts w:ascii="TH Sarabun New" w:hAnsi="TH Sarabun New" w:cs="TH Sarabun New"/>
+          <w:sz w:val="32"/>
+          <w:szCs w:val="32"/>
           <w:lang w:bidi="th-TH"/>
         </w:rPr>
         <w:t>Reward (</w:t>
@@ -3901,6 +3954,8 @@
         <w:rPr>
           <w:rStyle w:val="StrongEmphasis"/>
           <w:rFonts w:ascii="TH Sarabun New" w:hAnsi="TH Sarabun New" w:cs="TH Sarabun New"/>
+          <w:sz w:val="32"/>
+          <w:szCs w:val="32"/>
           <w:cs/>
           <w:lang w:bidi="th-TH"/>
         </w:rPr>
@@ -3973,6 +4028,8 @@
         <w:rPr>
           <w:rStyle w:val="StrongEmphasis"/>
           <w:rFonts w:ascii="TH Sarabun New" w:hAnsi="TH Sarabun New" w:cs="TH Sarabun New"/>
+          <w:sz w:val="32"/>
+          <w:szCs w:val="32"/>
           <w:lang w:bidi="th-TH"/>
         </w:rPr>
         <w:t>Progress (</w:t>
@@ -3981,6 +4038,8 @@
         <w:rPr>
           <w:rStyle w:val="StrongEmphasis"/>
           <w:rFonts w:ascii="TH Sarabun New" w:hAnsi="TH Sarabun New" w:cs="TH Sarabun New"/>
+          <w:sz w:val="32"/>
+          <w:szCs w:val="32"/>
           <w:cs/>
           <w:lang w:bidi="th-TH"/>
         </w:rPr>
@@ -4192,13 +4251,15 @@
         <w:pStyle w:val="Heading1"/>
         <w:rPr>
           <w:rFonts w:ascii="TH Sarabun New" w:hAnsi="TH Sarabun New"/>
-          <w:lang w:bidi="th-TH"/>
-        </w:rPr>
-      </w:pPr>
-      <w:r>
-        <w:rPr>
-          <w:rStyle w:val="a3"/>
-          <w:rFonts w:ascii="TH Sarabun New" w:hAnsi="TH Sarabun New"/>
+          <w:szCs w:val="32"/>
+          <w:lang w:bidi="th-TH"/>
+        </w:rPr>
+      </w:pPr>
+      <w:r>
+        <w:rPr>
+          <w:rStyle w:val="a3"/>
+          <w:rFonts w:ascii="TH Sarabun New" w:hAnsi="TH Sarabun New"/>
+          <w:szCs w:val="32"/>
         </w:rPr>
         <w:t>8</w:t>
       </w:r>
@@ -4206,6 +4267,7 @@
         <w:rPr>
           <w:rStyle w:val="a3"/>
           <w:rFonts w:ascii="TH Sarabun New" w:hAnsi="TH Sarabun New"/>
+          <w:szCs w:val="32"/>
           <w:cs/>
           <w:lang w:bidi="th-TH"/>
         </w:rPr>
@@ -4215,6 +4277,7 @@
         <w:rPr>
           <w:rStyle w:val="a3"/>
           <w:rFonts w:ascii="TH Sarabun New" w:hAnsi="TH Sarabun New"/>
+          <w:szCs w:val="32"/>
           <w:cs/>
           <w:lang w:bidi="th-TH"/>
         </w:rPr>
@@ -4229,15 +4292,15 @@
           <w:numId w:val="15"/>
         </w:numPr>
         <w:rPr>
-          <w:rFonts w:ascii="TH Sarabun New" w:hAnsi="TH Sarabun New" w:cs="TH Sarabun New"/>
-        </w:rPr>
-      </w:pPr>
-      <w:r>
-        <w:rPr>
-          <w:rStyle w:val="a3"/>
-          <w:rFonts w:ascii="TH Sarabun New" w:hAnsi="TH Sarabun New" w:cs="TH Sarabun New"/>
-          <w:sz w:val="32"/>
-          <w:szCs w:val="32"/>
+          <w:rFonts w:ascii="TH Sarabun New" w:hAnsi="TH Sarabun New"/>
+          <w:sz w:val="32"/>
+        </w:rPr>
+      </w:pPr>
+      <w:r>
+        <w:rPr>
+          <w:rStyle w:val="a3"/>
+          <w:rFonts w:ascii="TH Sarabun New" w:hAnsi="TH Sarabun New"/>
+          <w:sz w:val="32"/>
           <w:cs/>
           <w:lang w:bidi="th-TH"/>
         </w:rPr>
@@ -4248,7 +4311,8 @@
       <w:pPr>
         <w:ind w:left="720"/>
         <w:rPr>
-          <w:rFonts w:ascii="TH Sarabun New" w:hAnsi="TH Sarabun New" w:cs="TH Sarabun New"/>
+          <w:rFonts w:ascii="TH Sarabun New" w:hAnsi="TH Sarabun New"/>
+          <w:sz w:val="32"/>
         </w:rPr>
       </w:pPr>
       <w:bookmarkStart w:id="0" w:name="user-content-41-ขอบเขตด้านประชากร"/>
@@ -4256,9 +4320,8 @@
       <w:r>
         <w:rPr>
           <w:rStyle w:val="a3"/>
-          <w:rFonts w:ascii="TH Sarabun New" w:hAnsi="TH Sarabun New" w:cs="TH Sarabun New"/>
-          <w:sz w:val="32"/>
-          <w:szCs w:val="32"/>
+          <w:rFonts w:ascii="TH Sarabun New" w:hAnsi="TH Sarabun New"/>
+          <w:sz w:val="32"/>
           <w:cs/>
           <w:lang w:bidi="th-TH"/>
         </w:rPr>
@@ -4267,18 +4330,16 @@
       <w:r>
         <w:rPr>
           <w:rStyle w:val="a3"/>
-          <w:rFonts w:ascii="TH Sarabun New" w:hAnsi="TH Sarabun New" w:cs="TH Sarabun New"/>
-          <w:sz w:val="32"/>
-          <w:szCs w:val="32"/>
+          <w:rFonts w:ascii="TH Sarabun New" w:hAnsi="TH Sarabun New"/>
+          <w:sz w:val="32"/>
         </w:rPr>
         <w:t>9</w:t>
       </w:r>
       <w:r>
         <w:rPr>
           <w:rStyle w:val="a3"/>
-          <w:rFonts w:ascii="TH Sarabun New" w:hAnsi="TH Sarabun New" w:cs="TH Sarabun New"/>
-          <w:sz w:val="32"/>
-          <w:szCs w:val="32"/>
+          <w:rFonts w:ascii="TH Sarabun New" w:hAnsi="TH Sarabun New"/>
+          <w:sz w:val="32"/>
           <w:lang w:bidi="th-TH"/>
         </w:rPr>
         <w:t>-</w:t>
@@ -4286,18 +4347,16 @@
       <w:r>
         <w:rPr>
           <w:rStyle w:val="a3"/>
-          <w:rFonts w:ascii="TH Sarabun New" w:hAnsi="TH Sarabun New" w:cs="TH Sarabun New"/>
-          <w:sz w:val="32"/>
-          <w:szCs w:val="32"/>
+          <w:rFonts w:ascii="TH Sarabun New" w:hAnsi="TH Sarabun New"/>
+          <w:sz w:val="32"/>
         </w:rPr>
         <w:t>15</w:t>
       </w:r>
       <w:r>
         <w:rPr>
           <w:rStyle w:val="a3"/>
-          <w:rFonts w:ascii="TH Sarabun New" w:hAnsi="TH Sarabun New" w:cs="TH Sarabun New"/>
-          <w:sz w:val="32"/>
-          <w:szCs w:val="32"/>
+          <w:rFonts w:ascii="TH Sarabun New" w:hAnsi="TH Sarabun New"/>
+          <w:sz w:val="32"/>
           <w:cs/>
           <w:lang w:bidi="th-TH"/>
         </w:rPr>
@@ -4312,15 +4371,15 @@
           <w:numId w:val="15"/>
         </w:numPr>
         <w:rPr>
-          <w:rFonts w:ascii="TH Sarabun New" w:hAnsi="TH Sarabun New" w:cs="TH Sarabun New"/>
-        </w:rPr>
-      </w:pPr>
-      <w:r>
-        <w:rPr>
-          <w:rStyle w:val="a3"/>
-          <w:rFonts w:ascii="TH Sarabun New" w:hAnsi="TH Sarabun New" w:cs="TH Sarabun New"/>
-          <w:sz w:val="32"/>
-          <w:szCs w:val="32"/>
+          <w:rFonts w:ascii="TH Sarabun New" w:hAnsi="TH Sarabun New"/>
+          <w:sz w:val="32"/>
+        </w:rPr>
+      </w:pPr>
+      <w:r>
+        <w:rPr>
+          <w:rStyle w:val="a3"/>
+          <w:rFonts w:ascii="TH Sarabun New" w:hAnsi="TH Sarabun New"/>
+          <w:sz w:val="32"/>
           <w:cs/>
           <w:lang w:bidi="th-TH"/>
         </w:rPr>
@@ -4338,6 +4397,8 @@
         <w:contextualSpacing/>
         <w:rPr>
           <w:rFonts w:ascii="TH Sarabun New" w:hAnsi="TH Sarabun New" w:cs="TH Sarabun New"/>
+          <w:sz w:val="32"/>
+          <w:szCs w:val="32"/>
         </w:rPr>
       </w:pPr>
       <w:bookmarkStart w:id="1" w:name="user-content-42-ขอบเขตด้านเนื้อหา"/>
@@ -4364,6 +4425,8 @@
         <w:spacing w:line="240" w:lineRule="auto"/>
         <w:rPr>
           <w:rFonts w:ascii="TH Sarabun New" w:hAnsi="TH Sarabun New" w:cs="TH Sarabun New"/>
+          <w:sz w:val="32"/>
+          <w:szCs w:val="32"/>
         </w:rPr>
       </w:pPr>
       <w:r>
@@ -4456,15 +4519,15 @@
           <w:numId w:val="15"/>
         </w:numPr>
         <w:rPr>
-          <w:rFonts w:ascii="TH Sarabun New" w:hAnsi="TH Sarabun New" w:cs="TH Sarabun New"/>
-        </w:rPr>
-      </w:pPr>
-      <w:r>
-        <w:rPr>
-          <w:rStyle w:val="a3"/>
-          <w:rFonts w:ascii="TH Sarabun New" w:hAnsi="TH Sarabun New" w:cs="TH Sarabun New"/>
-          <w:sz w:val="32"/>
-          <w:szCs w:val="32"/>
+          <w:rFonts w:ascii="TH Sarabun New" w:hAnsi="TH Sarabun New"/>
+          <w:sz w:val="32"/>
+        </w:rPr>
+      </w:pPr>
+      <w:r>
+        <w:rPr>
+          <w:rStyle w:val="a3"/>
+          <w:rFonts w:ascii="TH Sarabun New" w:hAnsi="TH Sarabun New"/>
+          <w:sz w:val="32"/>
           <w:cs/>
           <w:lang w:bidi="th-TH"/>
         </w:rPr>
@@ -4482,6 +4545,8 @@
         <w:contextualSpacing/>
         <w:rPr>
           <w:rFonts w:ascii="TH Sarabun New" w:hAnsi="TH Sarabun New" w:cs="TH Sarabun New"/>
+          <w:sz w:val="32"/>
+          <w:szCs w:val="32"/>
         </w:rPr>
       </w:pPr>
       <w:bookmarkStart w:id="2" w:name="user-content-43-ขอบเขตด้านเทคนิคและการพั"/>
@@ -4518,6 +4583,8 @@
         <w:contextualSpacing/>
         <w:rPr>
           <w:rFonts w:ascii="TH Sarabun New" w:hAnsi="TH Sarabun New" w:cs="TH Sarabun New"/>
+          <w:sz w:val="32"/>
+          <w:szCs w:val="32"/>
         </w:rPr>
       </w:pPr>
       <w:r>
@@ -4611,6 +4678,8 @@
         <w:spacing w:line="240" w:lineRule="auto"/>
         <w:rPr>
           <w:rFonts w:ascii="TH Sarabun New" w:hAnsi="TH Sarabun New" w:cs="TH Sarabun New"/>
+          <w:sz w:val="32"/>
+          <w:szCs w:val="32"/>
         </w:rPr>
       </w:pPr>
       <w:r>
@@ -5665,6 +5734,223 @@
 <file path=word/numbering.xml><?xml version="1.0" encoding="utf-8"?>
 <w:numbering xmlns:wpc="http://schemas.microsoft.com/office/word/2010/wordprocessingCanvas" xmlns:cx="http://schemas.microsoft.com/office/drawing/2014/chartex" xmlns:cx1="http://schemas.microsoft.com/office/drawing/2015/9/8/chartex" xmlns:cx2="http://schemas.microsoft.com/office/drawing/2015/10/21/chartex" xmlns:cx3="http://schemas.microsoft.com/office/drawing/2016/5/9/chartex" xmlns:cx4="http://schemas.microsoft.com/office/drawing/2016/5/10/chartex" xmlns:cx5="http://schemas.microsoft.com/office/drawing/2016/5/11/chartex" xmlns:cx6="http://schemas.microsoft.com/office/drawing/2016/5/12/chartex" xmlns:cx7="http://schemas.microsoft.com/office/drawing/2016/5/13/chartex" xmlns:cx8="http://schemas.microsoft.com/office/drawing/2016/5/14/chartex" xmlns:mc="http://schemas.openxmlformats.org/markup-compatibility/2006" xmlns:aink="http://schemas.microsoft.com/office/drawing/2016/ink" xmlns:am3d="http://schemas.microsoft.com/office/drawing/2017/model3d" xmlns:o="urn:schemas-microsoft-com:office:office" xmlns:oel="http://schemas.microsoft.com/office/2019/extlst" xmlns:r="http://schemas.openxmlformats.org/officeDocument/2006/relationships" xmlns:m="http://schemas.openxmlformats.org/officeDocument/2006/math" xmlns:v="urn:schemas-microsoft-com:vml" xmlns:wp14="http://schemas.microsoft.com/office/word/2010/wordprocessingDrawing" xmlns:wp="http://schemas.openxmlformats.org/drawingml/2006/wordprocessingDrawing" xmlns:w10="urn:schemas-microsoft-com:office:word" xmlns:w="http://schemas.openxmlformats.org/wordprocessingml/2006/main" xmlns:w14="http://schemas.microsoft.com/office/word/2010/wordml" xmlns:w15="http://schemas.microsoft.com/office/word/2012/wordml" xmlns:w16cex="http://schemas.microsoft.com/office/word/2018/wordml/cex" xmlns:w16cid="http://schemas.microsoft.com/office/word/2016/wordml/cid" xmlns:w16="http://schemas.microsoft.com/office/word/2018/wordml" xmlns:w16du="http://schemas.microsoft.com/office/word/2023/wordml/word16du" xmlns:w16sdtdh="http://schemas.microsoft.com/office/word/2020/wordml/sdtdatahash" xmlns:w16sdtfl="http://schemas.microsoft.com/office/word/2024/wordml/sdtformatlock" xmlns:w16se="http://schemas.microsoft.com/office/word/2015/wordml/symex" xmlns:wpg="http://schemas.microsoft.com/office/word/2010/wordprocessingGroup" xmlns:wpi="http://schemas.microsoft.com/office/word/2010/wordprocessingInk" xmlns:wne="http://schemas.microsoft.com/office/word/2006/wordml" xmlns:wps="http://schemas.microsoft.com/office/word/2010/wordprocessingShape" mc:Ignorable="w14 w15 w16se w16cid w16 w16cex w16sdtdh w16sdtfl w16du wp14">
   <w:abstractNum w:abstractNumId="0" w15:restartNumberingAfterBreak="0">
+    <w:nsid w:val="09C44AB4"/>
+    <w:multiLevelType w:val="multilevel"/>
+    <w:tmpl w:val="7F94F410"/>
+    <w:lvl w:ilvl="0">
+      <w:start w:val="1"/>
+      <w:numFmt w:val="decimal"/>
+      <w:lvlText w:val="%1."/>
+      <w:lvlJc w:val="left"/>
+      <w:pPr>
+        <w:ind w:left="709" w:hanging="283"/>
+      </w:pPr>
+    </w:lvl>
+    <w:lvl w:ilvl="1">
+      <w:start w:val="1"/>
+      <w:numFmt w:val="decimal"/>
+      <w:lvlText w:val="%2."/>
+      <w:lvlJc w:val="left"/>
+      <w:pPr>
+        <w:ind w:left="1418" w:hanging="283"/>
+      </w:pPr>
+    </w:lvl>
+    <w:lvl w:ilvl="2">
+      <w:start w:val="1"/>
+      <w:numFmt w:val="decimal"/>
+      <w:lvlText w:val="%3."/>
+      <w:lvlJc w:val="left"/>
+      <w:pPr>
+        <w:ind w:left="2127" w:hanging="283"/>
+      </w:pPr>
+    </w:lvl>
+    <w:lvl w:ilvl="3">
+      <w:start w:val="1"/>
+      <w:numFmt w:val="decimal"/>
+      <w:lvlText w:val="%4."/>
+      <w:lvlJc w:val="left"/>
+      <w:pPr>
+        <w:ind w:left="2836" w:hanging="283"/>
+      </w:pPr>
+    </w:lvl>
+    <w:lvl w:ilvl="4">
+      <w:start w:val="1"/>
+      <w:numFmt w:val="decimal"/>
+      <w:lvlText w:val="%5."/>
+      <w:lvlJc w:val="left"/>
+      <w:pPr>
+        <w:ind w:left="3545" w:hanging="283"/>
+      </w:pPr>
+    </w:lvl>
+    <w:lvl w:ilvl="5">
+      <w:start w:val="1"/>
+      <w:numFmt w:val="decimal"/>
+      <w:lvlText w:val="%6."/>
+      <w:lvlJc w:val="left"/>
+      <w:pPr>
+        <w:ind w:left="4254" w:hanging="283"/>
+      </w:pPr>
+    </w:lvl>
+    <w:lvl w:ilvl="6">
+      <w:start w:val="1"/>
+      <w:numFmt w:val="decimal"/>
+      <w:lvlText w:val="%7."/>
+      <w:lvlJc w:val="left"/>
+      <w:pPr>
+        <w:ind w:left="4963" w:hanging="283"/>
+      </w:pPr>
+    </w:lvl>
+    <w:lvl w:ilvl="7">
+      <w:start w:val="1"/>
+      <w:numFmt w:val="decimal"/>
+      <w:lvlText w:val="%8."/>
+      <w:lvlJc w:val="left"/>
+      <w:pPr>
+        <w:ind w:left="5672" w:hanging="283"/>
+      </w:pPr>
+    </w:lvl>
+    <w:lvl w:ilvl="8">
+      <w:start w:val="1"/>
+      <w:numFmt w:val="decimal"/>
+      <w:lvlText w:val="%9."/>
+      <w:lvlJc w:val="left"/>
+      <w:pPr>
+        <w:ind w:left="6381" w:hanging="283"/>
+      </w:pPr>
+    </w:lvl>
+  </w:abstractNum>
+  <w:abstractNum w:abstractNumId="1" w15:restartNumberingAfterBreak="0">
+    <w:nsid w:val="0A371FC2"/>
+    <w:multiLevelType w:val="multilevel"/>
+    <w:tmpl w:val="1E06404A"/>
+    <w:lvl w:ilvl="0">
+      <w:start w:val="1"/>
+      <w:numFmt w:val="decimal"/>
+      <w:lvlText w:val="%1"/>
+      <w:lvlJc w:val="left"/>
+      <w:pPr>
+        <w:ind w:left="375" w:hanging="375"/>
+      </w:pPr>
+      <w:rPr>
+        <w:rFonts w:asciiTheme="majorHAnsi" w:eastAsiaTheme="majorEastAsia" w:hAnsiTheme="majorHAnsi" w:hint="default"/>
+        <w:color w:val="000000" w:themeColor="text1"/>
+        <w:sz w:val="24"/>
+      </w:rPr>
+    </w:lvl>
+    <w:lvl w:ilvl="1">
+      <w:start w:val="1"/>
+      <w:numFmt w:val="decimal"/>
+      <w:lvlText w:val="%1.%2"/>
+      <w:lvlJc w:val="left"/>
+      <w:pPr>
+        <w:ind w:left="375" w:hanging="375"/>
+      </w:pPr>
+      <w:rPr>
+        <w:rFonts w:asciiTheme="majorHAnsi" w:eastAsiaTheme="majorEastAsia" w:hAnsiTheme="majorHAnsi" w:hint="default"/>
+        <w:color w:val="000000" w:themeColor="text1"/>
+        <w:sz w:val="24"/>
+      </w:rPr>
+    </w:lvl>
+    <w:lvl w:ilvl="2">
+      <w:start w:val="1"/>
+      <w:numFmt w:val="decimal"/>
+      <w:lvlText w:val="%1.%2.%3"/>
+      <w:lvlJc w:val="left"/>
+      <w:pPr>
+        <w:ind w:left="720" w:hanging="720"/>
+      </w:pPr>
+      <w:rPr>
+        <w:rFonts w:asciiTheme="majorHAnsi" w:eastAsiaTheme="majorEastAsia" w:hAnsiTheme="majorHAnsi" w:hint="default"/>
+        <w:color w:val="000000" w:themeColor="text1"/>
+        <w:sz w:val="24"/>
+      </w:rPr>
+    </w:lvl>
+    <w:lvl w:ilvl="3">
+      <w:start w:val="1"/>
+      <w:numFmt w:val="decimal"/>
+      <w:lvlText w:val="%1.%2.%3.%4"/>
+      <w:lvlJc w:val="left"/>
+      <w:pPr>
+        <w:ind w:left="720" w:hanging="720"/>
+      </w:pPr>
+      <w:rPr>
+        <w:rFonts w:asciiTheme="majorHAnsi" w:eastAsiaTheme="majorEastAsia" w:hAnsiTheme="majorHAnsi" w:hint="default"/>
+        <w:color w:val="000000" w:themeColor="text1"/>
+        <w:sz w:val="24"/>
+      </w:rPr>
+    </w:lvl>
+    <w:lvl w:ilvl="4">
+      <w:start w:val="1"/>
+      <w:numFmt w:val="decimal"/>
+      <w:lvlText w:val="%1.%2.%3.%4.%5"/>
+      <w:lvlJc w:val="left"/>
+      <w:pPr>
+        <w:ind w:left="1080" w:hanging="1080"/>
+      </w:pPr>
+      <w:rPr>
+        <w:rFonts w:asciiTheme="majorHAnsi" w:eastAsiaTheme="majorEastAsia" w:hAnsiTheme="majorHAnsi" w:hint="default"/>
+        <w:color w:val="000000" w:themeColor="text1"/>
+        <w:sz w:val="24"/>
+      </w:rPr>
+    </w:lvl>
+    <w:lvl w:ilvl="5">
+      <w:start w:val="1"/>
+      <w:numFmt w:val="decimal"/>
+      <w:lvlText w:val="%1.%2.%3.%4.%5.%6"/>
+      <w:lvlJc w:val="left"/>
+      <w:pPr>
+        <w:ind w:left="1080" w:hanging="1080"/>
+      </w:pPr>
+      <w:rPr>
+        <w:rFonts w:asciiTheme="majorHAnsi" w:eastAsiaTheme="majorEastAsia" w:hAnsiTheme="majorHAnsi" w:hint="default"/>
+        <w:color w:val="000000" w:themeColor="text1"/>
+        <w:sz w:val="24"/>
+      </w:rPr>
+    </w:lvl>
+    <w:lvl w:ilvl="6">
+      <w:start w:val="1"/>
+      <w:numFmt w:val="decimal"/>
+      <w:lvlText w:val="%1.%2.%3.%4.%5.%6.%7"/>
+      <w:lvlJc w:val="left"/>
+      <w:pPr>
+        <w:ind w:left="1440" w:hanging="1440"/>
+      </w:pPr>
+      <w:rPr>
+        <w:rFonts w:asciiTheme="majorHAnsi" w:eastAsiaTheme="majorEastAsia" w:hAnsiTheme="majorHAnsi" w:hint="default"/>
+        <w:color w:val="000000" w:themeColor="text1"/>
+        <w:sz w:val="24"/>
+      </w:rPr>
+    </w:lvl>
+    <w:lvl w:ilvl="7">
+      <w:start w:val="1"/>
+      <w:numFmt w:val="decimal"/>
+      <w:lvlText w:val="%1.%2.%3.%4.%5.%6.%7.%8"/>
+      <w:lvlJc w:val="left"/>
+      <w:pPr>
+        <w:ind w:left="1440" w:hanging="1440"/>
+      </w:pPr>
+      <w:rPr>
+        <w:rFonts w:asciiTheme="majorHAnsi" w:eastAsiaTheme="majorEastAsia" w:hAnsiTheme="majorHAnsi" w:hint="default"/>
+        <w:color w:val="000000" w:themeColor="text1"/>
+        <w:sz w:val="24"/>
+      </w:rPr>
+    </w:lvl>
+    <w:lvl w:ilvl="8">
+      <w:start w:val="1"/>
+      <w:numFmt w:val="decimal"/>
+      <w:lvlText w:val="%1.%2.%3.%4.%5.%6.%7.%8.%9"/>
+      <w:lvlJc w:val="left"/>
+      <w:pPr>
+        <w:ind w:left="1800" w:hanging="1800"/>
+      </w:pPr>
+      <w:rPr>
+        <w:rFonts w:asciiTheme="majorHAnsi" w:eastAsiaTheme="majorEastAsia" w:hAnsiTheme="majorHAnsi" w:hint="default"/>
+        <w:color w:val="000000" w:themeColor="text1"/>
+        <w:sz w:val="24"/>
+      </w:rPr>
+    </w:lvl>
+  </w:abstractNum>
+  <w:abstractNum w:abstractNumId="2" w15:restartNumberingAfterBreak="0">
     <w:nsid w:val="0B3F0FB0"/>
     <w:multiLevelType w:val="multilevel"/>
     <w:tmpl w:val="304AEF4A"/>
@@ -5768,7 +6054,7 @@
       </w:rPr>
     </w:lvl>
   </w:abstractNum>
-  <w:abstractNum w:abstractNumId="1" w15:restartNumberingAfterBreak="0">
+  <w:abstractNum w:abstractNumId="3" w15:restartNumberingAfterBreak="0">
     <w:nsid w:val="0CCA5622"/>
     <w:multiLevelType w:val="hybridMultilevel"/>
     <w:tmpl w:val="1BB4425C"/>
@@ -5881,7 +6167,7 @@
       </w:rPr>
     </w:lvl>
   </w:abstractNum>
-  <w:abstractNum w:abstractNumId="2" w15:restartNumberingAfterBreak="0">
+  <w:abstractNum w:abstractNumId="4" w15:restartNumberingAfterBreak="0">
     <w:nsid w:val="1FB46DE6"/>
     <w:multiLevelType w:val="multilevel"/>
     <w:tmpl w:val="CC3A8826"/>
@@ -5967,7 +6253,7 @@
       </w:pPr>
     </w:lvl>
   </w:abstractNum>
-  <w:abstractNum w:abstractNumId="3" w15:restartNumberingAfterBreak="0">
+  <w:abstractNum w:abstractNumId="5" w15:restartNumberingAfterBreak="0">
     <w:nsid w:val="20B45AD5"/>
     <w:multiLevelType w:val="multilevel"/>
     <w:tmpl w:val="CDB2CA6A"/>
@@ -6060,7 +6346,179 @@
       </w:pPr>
     </w:lvl>
   </w:abstractNum>
-  <w:abstractNum w:abstractNumId="4" w15:restartNumberingAfterBreak="0">
+  <w:abstractNum w:abstractNumId="6" w15:restartNumberingAfterBreak="0">
+    <w:nsid w:val="23023746"/>
+    <w:multiLevelType w:val="multilevel"/>
+    <w:tmpl w:val="0409001F"/>
+    <w:lvl w:ilvl="0">
+      <w:start w:val="1"/>
+      <w:numFmt w:val="decimal"/>
+      <w:lvlText w:val="%1."/>
+      <w:lvlJc w:val="left"/>
+      <w:pPr>
+        <w:ind w:left="360" w:hanging="360"/>
+      </w:pPr>
+    </w:lvl>
+    <w:lvl w:ilvl="1">
+      <w:start w:val="1"/>
+      <w:numFmt w:val="decimal"/>
+      <w:lvlText w:val="%1.%2."/>
+      <w:lvlJc w:val="left"/>
+      <w:pPr>
+        <w:ind w:left="792" w:hanging="432"/>
+      </w:pPr>
+    </w:lvl>
+    <w:lvl w:ilvl="2">
+      <w:start w:val="1"/>
+      <w:numFmt w:val="decimal"/>
+      <w:lvlText w:val="%1.%2.%3."/>
+      <w:lvlJc w:val="left"/>
+      <w:pPr>
+        <w:ind w:left="1224" w:hanging="504"/>
+      </w:pPr>
+    </w:lvl>
+    <w:lvl w:ilvl="3">
+      <w:start w:val="1"/>
+      <w:numFmt w:val="decimal"/>
+      <w:lvlText w:val="%1.%2.%3.%4."/>
+      <w:lvlJc w:val="left"/>
+      <w:pPr>
+        <w:ind w:left="1728" w:hanging="648"/>
+      </w:pPr>
+    </w:lvl>
+    <w:lvl w:ilvl="4">
+      <w:start w:val="1"/>
+      <w:numFmt w:val="decimal"/>
+      <w:lvlText w:val="%1.%2.%3.%4.%5."/>
+      <w:lvlJc w:val="left"/>
+      <w:pPr>
+        <w:ind w:left="2232" w:hanging="792"/>
+      </w:pPr>
+    </w:lvl>
+    <w:lvl w:ilvl="5">
+      <w:start w:val="1"/>
+      <w:numFmt w:val="decimal"/>
+      <w:lvlText w:val="%1.%2.%3.%4.%5.%6."/>
+      <w:lvlJc w:val="left"/>
+      <w:pPr>
+        <w:ind w:left="2736" w:hanging="936"/>
+      </w:pPr>
+    </w:lvl>
+    <w:lvl w:ilvl="6">
+      <w:start w:val="1"/>
+      <w:numFmt w:val="decimal"/>
+      <w:lvlText w:val="%1.%2.%3.%4.%5.%6.%7."/>
+      <w:lvlJc w:val="left"/>
+      <w:pPr>
+        <w:ind w:left="3240" w:hanging="1080"/>
+      </w:pPr>
+    </w:lvl>
+    <w:lvl w:ilvl="7">
+      <w:start w:val="1"/>
+      <w:numFmt w:val="decimal"/>
+      <w:lvlText w:val="%1.%2.%3.%4.%5.%6.%7.%8."/>
+      <w:lvlJc w:val="left"/>
+      <w:pPr>
+        <w:ind w:left="3744" w:hanging="1224"/>
+      </w:pPr>
+    </w:lvl>
+    <w:lvl w:ilvl="8">
+      <w:start w:val="1"/>
+      <w:numFmt w:val="decimal"/>
+      <w:lvlText w:val="%1.%2.%3.%4.%5.%6.%7.%8.%9."/>
+      <w:lvlJc w:val="left"/>
+      <w:pPr>
+        <w:ind w:left="4320" w:hanging="1440"/>
+      </w:pPr>
+    </w:lvl>
+  </w:abstractNum>
+  <w:abstractNum w:abstractNumId="7" w15:restartNumberingAfterBreak="0">
+    <w:nsid w:val="27884819"/>
+    <w:multiLevelType w:val="multilevel"/>
+    <w:tmpl w:val="0409001F"/>
+    <w:lvl w:ilvl="0">
+      <w:start w:val="1"/>
+      <w:numFmt w:val="decimal"/>
+      <w:lvlText w:val="%1."/>
+      <w:lvlJc w:val="left"/>
+      <w:pPr>
+        <w:ind w:left="360" w:hanging="360"/>
+      </w:pPr>
+    </w:lvl>
+    <w:lvl w:ilvl="1">
+      <w:start w:val="1"/>
+      <w:numFmt w:val="decimal"/>
+      <w:lvlText w:val="%1.%2."/>
+      <w:lvlJc w:val="left"/>
+      <w:pPr>
+        <w:ind w:left="792" w:hanging="432"/>
+      </w:pPr>
+    </w:lvl>
+    <w:lvl w:ilvl="2">
+      <w:start w:val="1"/>
+      <w:numFmt w:val="decimal"/>
+      <w:lvlText w:val="%1.%2.%3."/>
+      <w:lvlJc w:val="left"/>
+      <w:pPr>
+        <w:ind w:left="1224" w:hanging="504"/>
+      </w:pPr>
+    </w:lvl>
+    <w:lvl w:ilvl="3">
+      <w:start w:val="1"/>
+      <w:numFmt w:val="decimal"/>
+      <w:lvlText w:val="%1.%2.%3.%4."/>
+      <w:lvlJc w:val="left"/>
+      <w:pPr>
+        <w:ind w:left="1728" w:hanging="648"/>
+      </w:pPr>
+    </w:lvl>
+    <w:lvl w:ilvl="4">
+      <w:start w:val="1"/>
+      <w:numFmt w:val="decimal"/>
+      <w:lvlText w:val="%1.%2.%3.%4.%5."/>
+      <w:lvlJc w:val="left"/>
+      <w:pPr>
+        <w:ind w:left="2232" w:hanging="792"/>
+      </w:pPr>
+    </w:lvl>
+    <w:lvl w:ilvl="5">
+      <w:start w:val="1"/>
+      <w:numFmt w:val="decimal"/>
+      <w:lvlText w:val="%1.%2.%3.%4.%5.%6."/>
+      <w:lvlJc w:val="left"/>
+      <w:pPr>
+        <w:ind w:left="2736" w:hanging="936"/>
+      </w:pPr>
+    </w:lvl>
+    <w:lvl w:ilvl="6">
+      <w:start w:val="1"/>
+      <w:numFmt w:val="decimal"/>
+      <w:lvlText w:val="%1.%2.%3.%4.%5.%6.%7."/>
+      <w:lvlJc w:val="left"/>
+      <w:pPr>
+        <w:ind w:left="3240" w:hanging="1080"/>
+      </w:pPr>
+    </w:lvl>
+    <w:lvl w:ilvl="7">
+      <w:start w:val="1"/>
+      <w:numFmt w:val="decimal"/>
+      <w:lvlText w:val="%1.%2.%3.%4.%5.%6.%7.%8."/>
+      <w:lvlJc w:val="left"/>
+      <w:pPr>
+        <w:ind w:left="3744" w:hanging="1224"/>
+      </w:pPr>
+    </w:lvl>
+    <w:lvl w:ilvl="8">
+      <w:start w:val="1"/>
+      <w:numFmt w:val="decimal"/>
+      <w:lvlText w:val="%1.%2.%3.%4.%5.%6.%7.%8.%9."/>
+      <w:lvlJc w:val="left"/>
+      <w:pPr>
+        <w:ind w:left="4320" w:hanging="1440"/>
+      </w:pPr>
+    </w:lvl>
+  </w:abstractNum>
+  <w:abstractNum w:abstractNumId="8" w15:restartNumberingAfterBreak="0">
     <w:nsid w:val="2880794F"/>
     <w:multiLevelType w:val="hybridMultilevel"/>
     <w:tmpl w:val="40D8EE7A"/>
@@ -6173,7 +6631,93 @@
       </w:rPr>
     </w:lvl>
   </w:abstractNum>
-  <w:abstractNum w:abstractNumId="5" w15:restartNumberingAfterBreak="0">
+  <w:abstractNum w:abstractNumId="9" w15:restartNumberingAfterBreak="0">
+    <w:nsid w:val="2BD12AE9"/>
+    <w:multiLevelType w:val="hybridMultilevel"/>
+    <w:tmpl w:val="E6AE5362"/>
+    <w:lvl w:ilvl="0" w:tplc="0409000F">
+      <w:start w:val="1"/>
+      <w:numFmt w:val="decimal"/>
+      <w:lvlText w:val="%1."/>
+      <w:lvlJc w:val="left"/>
+      <w:pPr>
+        <w:ind w:left="720" w:hanging="360"/>
+      </w:pPr>
+    </w:lvl>
+    <w:lvl w:ilvl="1" w:tplc="04090019" w:tentative="1">
+      <w:start w:val="1"/>
+      <w:numFmt w:val="lowerLetter"/>
+      <w:lvlText w:val="%2."/>
+      <w:lvlJc w:val="left"/>
+      <w:pPr>
+        <w:ind w:left="1440" w:hanging="360"/>
+      </w:pPr>
+    </w:lvl>
+    <w:lvl w:ilvl="2" w:tplc="0409001B" w:tentative="1">
+      <w:start w:val="1"/>
+      <w:numFmt w:val="lowerRoman"/>
+      <w:lvlText w:val="%3."/>
+      <w:lvlJc w:val="right"/>
+      <w:pPr>
+        <w:ind w:left="2160" w:hanging="180"/>
+      </w:pPr>
+    </w:lvl>
+    <w:lvl w:ilvl="3" w:tplc="0409000F" w:tentative="1">
+      <w:start w:val="1"/>
+      <w:numFmt w:val="decimal"/>
+      <w:lvlText w:val="%4."/>
+      <w:lvlJc w:val="left"/>
+      <w:pPr>
+        <w:ind w:left="2880" w:hanging="360"/>
+      </w:pPr>
+    </w:lvl>
+    <w:lvl w:ilvl="4" w:tplc="04090019" w:tentative="1">
+      <w:start w:val="1"/>
+      <w:numFmt w:val="lowerLetter"/>
+      <w:lvlText w:val="%5."/>
+      <w:lvlJc w:val="left"/>
+      <w:pPr>
+        <w:ind w:left="3600" w:hanging="360"/>
+      </w:pPr>
+    </w:lvl>
+    <w:lvl w:ilvl="5" w:tplc="0409001B" w:tentative="1">
+      <w:start w:val="1"/>
+      <w:numFmt w:val="lowerRoman"/>
+      <w:lvlText w:val="%6."/>
+      <w:lvlJc w:val="right"/>
+      <w:pPr>
+        <w:ind w:left="4320" w:hanging="180"/>
+      </w:pPr>
+    </w:lvl>
+    <w:lvl w:ilvl="6" w:tplc="0409000F" w:tentative="1">
+      <w:start w:val="1"/>
+      <w:numFmt w:val="decimal"/>
+      <w:lvlText w:val="%7."/>
+      <w:lvlJc w:val="left"/>
+      <w:pPr>
+        <w:ind w:left="5040" w:hanging="360"/>
+      </w:pPr>
+    </w:lvl>
+    <w:lvl w:ilvl="7" w:tplc="04090019" w:tentative="1">
+      <w:start w:val="1"/>
+      <w:numFmt w:val="lowerLetter"/>
+      <w:lvlText w:val="%8."/>
+      <w:lvlJc w:val="left"/>
+      <w:pPr>
+        <w:ind w:left="5760" w:hanging="360"/>
+      </w:pPr>
+    </w:lvl>
+    <w:lvl w:ilvl="8" w:tplc="0409001B" w:tentative="1">
+      <w:start w:val="1"/>
+      <w:numFmt w:val="lowerRoman"/>
+      <w:lvlText w:val="%9."/>
+      <w:lvlJc w:val="right"/>
+      <w:pPr>
+        <w:ind w:left="6480" w:hanging="180"/>
+      </w:pPr>
+    </w:lvl>
+  </w:abstractNum>
+  <w:abstractNum w:abstractNumId="10" w15:restartNumberingAfterBreak="0">
     <w:nsid w:val="32FB7955"/>
     <w:multiLevelType w:val="multilevel"/>
     <w:tmpl w:val="066255C6"/>
@@ -6277,7 +6821,93 @@
       </w:rPr>
     </w:lvl>
   </w:abstractNum>
-  <w:abstractNum w:abstractNumId="6" w15:restartNumberingAfterBreak="0">
+  <w:abstractNum w:abstractNumId="11" w15:restartNumberingAfterBreak="0">
+    <w:nsid w:val="35401FC6"/>
+    <w:multiLevelType w:val="multilevel"/>
+    <w:tmpl w:val="0409001F"/>
+    <w:lvl w:ilvl="0">
+      <w:start w:val="1"/>
+      <w:numFmt w:val="decimal"/>
+      <w:lvlText w:val="%1."/>
+      <w:lvlJc w:val="left"/>
+      <w:pPr>
+        <w:ind w:left="360" w:hanging="360"/>
+      </w:pPr>
+    </w:lvl>
+    <w:lvl w:ilvl="1">
+      <w:start w:val="1"/>
+      <w:numFmt w:val="decimal"/>
+      <w:lvlText w:val="%1.%2."/>
+      <w:lvlJc w:val="left"/>
+      <w:pPr>
+        <w:ind w:left="792" w:hanging="432"/>
+      </w:pPr>
+    </w:lvl>
+    <w:lvl w:ilvl="2">
+      <w:start w:val="1"/>
+      <w:numFmt w:val="decimal"/>
+      <w:lvlText w:val="%1.%2.%3."/>
+      <w:lvlJc w:val="left"/>
+      <w:pPr>
+        <w:ind w:left="1224" w:hanging="504"/>
+      </w:pPr>
+    </w:lvl>
+    <w:lvl w:ilvl="3">
+      <w:start w:val="1"/>
+      <w:numFmt w:val="decimal"/>
+      <w:lvlText w:val="%1.%2.%3.%4."/>
+      <w:lvlJc w:val="left"/>
+      <w:pPr>
+        <w:ind w:left="1728" w:hanging="648"/>
+      </w:pPr>
+    </w:lvl>
+    <w:lvl w:ilvl="4">
+      <w:start w:val="1"/>
+      <w:numFmt w:val="decimal"/>
+      <w:lvlText w:val="%1.%2.%3.%4.%5."/>
+      <w:lvlJc w:val="left"/>
+      <w:pPr>
+        <w:ind w:left="2232" w:hanging="792"/>
+      </w:pPr>
+    </w:lvl>
+    <w:lvl w:ilvl="5">
+      <w:start w:val="1"/>
+      <w:numFmt w:val="decimal"/>
+      <w:lvlText w:val="%1.%2.%3.%4.%5.%6."/>
+      <w:lvlJc w:val="left"/>
+      <w:pPr>
+        <w:ind w:left="2736" w:hanging="936"/>
+      </w:pPr>
+    </w:lvl>
+    <w:lvl w:ilvl="6">
+      <w:start w:val="1"/>
+      <w:numFmt w:val="decimal"/>
+      <w:lvlText w:val="%1.%2.%3.%4.%5.%6.%7."/>
+      <w:lvlJc w:val="left"/>
+      <w:pPr>
+        <w:ind w:left="3240" w:hanging="1080"/>
+      </w:pPr>
+    </w:lvl>
+    <w:lvl w:ilvl="7">
+      <w:start w:val="1"/>
+      <w:numFmt w:val="decimal"/>
+      <w:lvlText w:val="%1.%2.%3.%4.%5.%6.%7.%8."/>
+      <w:lvlJc w:val="left"/>
+      <w:pPr>
+        <w:ind w:left="3744" w:hanging="1224"/>
+      </w:pPr>
+    </w:lvl>
+    <w:lvl w:ilvl="8">
+      <w:start w:val="1"/>
+      <w:numFmt w:val="decimal"/>
+      <w:lvlText w:val="%1.%2.%3.%4.%5.%6.%7.%8.%9."/>
+      <w:lvlJc w:val="left"/>
+      <w:pPr>
+        <w:ind w:left="4320" w:hanging="1440"/>
+      </w:pPr>
+    </w:lvl>
+  </w:abstractNum>
+  <w:abstractNum w:abstractNumId="12" w15:restartNumberingAfterBreak="0">
     <w:nsid w:val="36982CA4"/>
     <w:multiLevelType w:val="hybridMultilevel"/>
     <w:tmpl w:val="B33CBADA"/>
@@ -6363,7 +6993,7 @@
       </w:pPr>
     </w:lvl>
   </w:abstractNum>
-  <w:abstractNum w:abstractNumId="7" w15:restartNumberingAfterBreak="0">
+  <w:abstractNum w:abstractNumId="13" w15:restartNumberingAfterBreak="0">
     <w:nsid w:val="388057C1"/>
     <w:multiLevelType w:val="multilevel"/>
     <w:tmpl w:val="8DEAED26"/>
@@ -6467,93 +7097,93 @@
       </w:rPr>
     </w:lvl>
   </w:abstractNum>
-  <w:abstractNum w:abstractNumId="8" w15:restartNumberingAfterBreak="0">
+  <w:abstractNum w:abstractNumId="14" w15:restartNumberingAfterBreak="0">
     <w:nsid w:val="3B172D3A"/>
     <w:multiLevelType w:val="multilevel"/>
-    <w:tmpl w:val="7F94F410"/>
+    <w:tmpl w:val="0409001F"/>
     <w:lvl w:ilvl="0">
       <w:start w:val="1"/>
       <w:numFmt w:val="decimal"/>
       <w:lvlText w:val="%1."/>
       <w:lvlJc w:val="left"/>
       <w:pPr>
-        <w:ind w:left="709" w:hanging="283"/>
+        <w:ind w:left="360" w:hanging="360"/>
       </w:pPr>
     </w:lvl>
     <w:lvl w:ilvl="1">
       <w:start w:val="1"/>
       <w:numFmt w:val="decimal"/>
-      <w:lvlText w:val="%2."/>
-      <w:lvlJc w:val="left"/>
-      <w:pPr>
-        <w:ind w:left="1418" w:hanging="283"/>
+      <w:lvlText w:val="%1.%2."/>
+      <w:lvlJc w:val="left"/>
+      <w:pPr>
+        <w:ind w:left="792" w:hanging="432"/>
       </w:pPr>
     </w:lvl>
     <w:lvl w:ilvl="2">
       <w:start w:val="1"/>
       <w:numFmt w:val="decimal"/>
-      <w:lvlText w:val="%3."/>
-      <w:lvlJc w:val="left"/>
-      <w:pPr>
-        <w:ind w:left="2127" w:hanging="283"/>
+      <w:lvlText w:val="%1.%2.%3."/>
+      <w:lvlJc w:val="left"/>
+      <w:pPr>
+        <w:ind w:left="1224" w:hanging="504"/>
       </w:pPr>
     </w:lvl>
     <w:lvl w:ilvl="3">
       <w:start w:val="1"/>
       <w:numFmt w:val="decimal"/>
-      <w:lvlText w:val="%4."/>
-      <w:lvlJc w:val="left"/>
-      <w:pPr>
-        <w:ind w:left="2836" w:hanging="283"/>
+      <w:lvlText w:val="%1.%2.%3.%4."/>
+      <w:lvlJc w:val="left"/>
+      <w:pPr>
+        <w:ind w:left="1728" w:hanging="648"/>
       </w:pPr>
     </w:lvl>
     <w:lvl w:ilvl="4">
       <w:start w:val="1"/>
       <w:numFmt w:val="decimal"/>
-      <w:lvlText w:val="%5."/>
-      <w:lvlJc w:val="left"/>
-      <w:pPr>
-        <w:ind w:left="3545" w:hanging="283"/>
+      <w:lvlText w:val="%1.%2.%3.%4.%5."/>
+      <w:lvlJc w:val="left"/>
+      <w:pPr>
+        <w:ind w:left="2232" w:hanging="792"/>
       </w:pPr>
     </w:lvl>
     <w:lvl w:ilvl="5">
       <w:start w:val="1"/>
       <w:numFmt w:val="decimal"/>
-      <w:lvlText w:val="%6."/>
-      <w:lvlJc w:val="left"/>
-      <w:pPr>
-        <w:ind w:left="4254" w:hanging="283"/>
+      <w:lvlText w:val="%1.%2.%3.%4.%5.%6."/>
+      <w:lvlJc w:val="left"/>
+      <w:pPr>
+        <w:ind w:left="2736" w:hanging="936"/>
       </w:pPr>
     </w:lvl>
     <w:lvl w:ilvl="6">
       <w:start w:val="1"/>
       <w:numFmt w:val="decimal"/>
-      <w:lvlText w:val="%7."/>
-      <w:lvlJc w:val="left"/>
-      <w:pPr>
-        <w:ind w:left="4963" w:hanging="283"/>
+      <w:lvlText w:val="%1.%2.%3.%4.%5.%6.%7."/>
+      <w:lvlJc w:val="left"/>
+      <w:pPr>
+        <w:ind w:left="3240" w:hanging="1080"/>
       </w:pPr>
     </w:lvl>
     <w:lvl w:ilvl="7">
       <w:start w:val="1"/>
       <w:numFmt w:val="decimal"/>
-      <w:lvlText w:val="%8."/>
-      <w:lvlJc w:val="left"/>
-      <w:pPr>
-        <w:ind w:left="5672" w:hanging="283"/>
+      <w:lvlText w:val="%1.%2.%3.%4.%5.%6.%7.%8."/>
+      <w:lvlJc w:val="left"/>
+      <w:pPr>
+        <w:ind w:left="3744" w:hanging="1224"/>
       </w:pPr>
     </w:lvl>
     <w:lvl w:ilvl="8">
       <w:start w:val="1"/>
       <w:numFmt w:val="decimal"/>
-      <w:lvlText w:val="%9."/>
-      <w:lvlJc w:val="left"/>
-      <w:pPr>
-        <w:ind w:left="6381" w:hanging="283"/>
+      <w:lvlText w:val="%1.%2.%3.%4.%5.%6.%7.%8.%9."/>
+      <w:lvlJc w:val="left"/>
+      <w:pPr>
+        <w:ind w:left="4320" w:hanging="1440"/>
       </w:pPr>
     </w:lvl>
   </w:abstractNum>
-  <w:abstractNum w:abstractNumId="9" w15:restartNumberingAfterBreak="0">
+  <w:abstractNum w:abstractNumId="15" w15:restartNumberingAfterBreak="0">
     <w:nsid w:val="40264194"/>
     <w:multiLevelType w:val="multilevel"/>
     <w:tmpl w:val="F626C44C"/>
@@ -6657,7 +7287,7 @@
       </w:rPr>
     </w:lvl>
   </w:abstractNum>
-  <w:abstractNum w:abstractNumId="10" w15:restartNumberingAfterBreak="0">
+  <w:abstractNum w:abstractNumId="16" w15:restartNumberingAfterBreak="0">
     <w:nsid w:val="459C31D4"/>
     <w:multiLevelType w:val="multilevel"/>
     <w:tmpl w:val="C366CA66"/>
@@ -6753,7 +7383,93 @@
       </w:pPr>
     </w:lvl>
   </w:abstractNum>
-  <w:abstractNum w:abstractNumId="11" w15:restartNumberingAfterBreak="0">
+  <w:abstractNum w:abstractNumId="17" w15:restartNumberingAfterBreak="0">
+    <w:nsid w:val="49964BD1"/>
+    <w:multiLevelType w:val="multilevel"/>
+    <w:tmpl w:val="7F94F410"/>
+    <w:lvl w:ilvl="0">
+      <w:start w:val="1"/>
+      <w:numFmt w:val="decimal"/>
+      <w:lvlText w:val="%1."/>
+      <w:lvlJc w:val="left"/>
+      <w:pPr>
+        <w:ind w:left="709" w:hanging="283"/>
+      </w:pPr>
+    </w:lvl>
+    <w:lvl w:ilvl="1">
+      <w:start w:val="1"/>
+      <w:numFmt w:val="decimal"/>
+      <w:lvlText w:val="%2."/>
+      <w:lvlJc w:val="left"/>
+      <w:pPr>
+        <w:ind w:left="1418" w:hanging="283"/>
+      </w:pPr>
+    </w:lvl>
+    <w:lvl w:ilvl="2">
+      <w:start w:val="1"/>
+      <w:numFmt w:val="decimal"/>
+      <w:lvlText w:val="%3."/>
+      <w:lvlJc w:val="left"/>
+      <w:pPr>
+        <w:ind w:left="2127" w:hanging="283"/>
+      </w:pPr>
+    </w:lvl>
+    <w:lvl w:ilvl="3">
+      <w:start w:val="1"/>
+      <w:numFmt w:val="decimal"/>
+      <w:lvlText w:val="%4."/>
+      <w:lvlJc w:val="left"/>
+      <w:pPr>
+        <w:ind w:left="2836" w:hanging="283"/>
+      </w:pPr>
+    </w:lvl>
+    <w:lvl w:ilvl="4">
+      <w:start w:val="1"/>
+      <w:numFmt w:val="decimal"/>
+      <w:lvlText w:val="%5."/>
+      <w:lvlJc w:val="left"/>
+      <w:pPr>
+        <w:ind w:left="3545" w:hanging="283"/>
+      </w:pPr>
+    </w:lvl>
+    <w:lvl w:ilvl="5">
+      <w:start w:val="1"/>
+      <w:numFmt w:val="decimal"/>
+      <w:lvlText w:val="%6."/>
+      <w:lvlJc w:val="left"/>
+      <w:pPr>
+        <w:ind w:left="4254" w:hanging="283"/>
+      </w:pPr>
+    </w:lvl>
+    <w:lvl w:ilvl="6">
+      <w:start w:val="1"/>
+      <w:numFmt w:val="decimal"/>
+      <w:lvlText w:val="%7."/>
+      <w:lvlJc w:val="left"/>
+      <w:pPr>
+        <w:ind w:left="4963" w:hanging="283"/>
+      </w:pPr>
+    </w:lvl>
+    <w:lvl w:ilvl="7">
+      <w:start w:val="1"/>
+      <w:numFmt w:val="decimal"/>
+      <w:lvlText w:val="%8."/>
+      <w:lvlJc w:val="left"/>
+      <w:pPr>
+        <w:ind w:left="5672" w:hanging="283"/>
+      </w:pPr>
+    </w:lvl>
+    <w:lvl w:ilvl="8">
+      <w:start w:val="1"/>
+      <w:numFmt w:val="decimal"/>
+      <w:lvlText w:val="%9."/>
+      <w:lvlJc w:val="left"/>
+      <w:pPr>
+        <w:ind w:left="6381" w:hanging="283"/>
+      </w:pPr>
+    </w:lvl>
+  </w:abstractNum>
+  <w:abstractNum w:abstractNumId="18" w15:restartNumberingAfterBreak="0">
     <w:nsid w:val="4B0F4E5F"/>
     <w:multiLevelType w:val="multilevel"/>
     <w:tmpl w:val="A69E79D6"/>
@@ -6839,7 +7555,7 @@
       </w:pPr>
     </w:lvl>
   </w:abstractNum>
-  <w:abstractNum w:abstractNumId="12" w15:restartNumberingAfterBreak="0">
+  <w:abstractNum w:abstractNumId="19" w15:restartNumberingAfterBreak="0">
     <w:nsid w:val="5192069C"/>
     <w:multiLevelType w:val="multilevel"/>
     <w:tmpl w:val="68FE5D82"/>
@@ -6935,7 +7651,93 @@
       </w:pPr>
     </w:lvl>
   </w:abstractNum>
-  <w:abstractNum w:abstractNumId="13" w15:restartNumberingAfterBreak="0">
+  <w:abstractNum w:abstractNumId="20" w15:restartNumberingAfterBreak="0">
+    <w:nsid w:val="57EF2240"/>
+    <w:multiLevelType w:val="hybridMultilevel"/>
+    <w:tmpl w:val="5F8CECDA"/>
+    <w:lvl w:ilvl="0" w:tplc="0409000F">
+      <w:start w:val="1"/>
+      <w:numFmt w:val="decimal"/>
+      <w:lvlText w:val="%1."/>
+      <w:lvlJc w:val="left"/>
+      <w:pPr>
+        <w:ind w:left="720" w:hanging="360"/>
+      </w:pPr>
+    </w:lvl>
+    <w:lvl w:ilvl="1" w:tplc="04090019" w:tentative="1">
+      <w:start w:val="1"/>
+      <w:numFmt w:val="lowerLetter"/>
+      <w:lvlText w:val="%2."/>
+      <w:lvlJc w:val="left"/>
+      <w:pPr>
+        <w:ind w:left="1440" w:hanging="360"/>
+      </w:pPr>
+    </w:lvl>
+    <w:lvl w:ilvl="2" w:tplc="0409001B" w:tentative="1">
+      <w:start w:val="1"/>
+      <w:numFmt w:val="lowerRoman"/>
+      <w:lvlText w:val="%3."/>
+      <w:lvlJc w:val="right"/>
+      <w:pPr>
+        <w:ind w:left="2160" w:hanging="180"/>
+      </w:pPr>
+    </w:lvl>
+    <w:lvl w:ilvl="3" w:tplc="0409000F" w:tentative="1">
+      <w:start w:val="1"/>
+      <w:numFmt w:val="decimal"/>
+      <w:lvlText w:val="%4."/>
+      <w:lvlJc w:val="left"/>
+      <w:pPr>
+        <w:ind w:left="2880" w:hanging="360"/>
+      </w:pPr>
+    </w:lvl>
+    <w:lvl w:ilvl="4" w:tplc="04090019" w:tentative="1">
+      <w:start w:val="1"/>
+      <w:numFmt w:val="lowerLetter"/>
+      <w:lvlText w:val="%5."/>
+      <w:lvlJc w:val="left"/>
+      <w:pPr>
+        <w:ind w:left="3600" w:hanging="360"/>
+      </w:pPr>
+    </w:lvl>
+    <w:lvl w:ilvl="5" w:tplc="0409001B" w:tentative="1">
+      <w:start w:val="1"/>
+      <w:numFmt w:val="lowerRoman"/>
+      <w:lvlText w:val="%6."/>
+      <w:lvlJc w:val="right"/>
+      <w:pPr>
+        <w:ind w:left="4320" w:hanging="180"/>
+      </w:pPr>
+    </w:lvl>
+    <w:lvl w:ilvl="6" w:tplc="0409000F" w:tentative="1">
+      <w:start w:val="1"/>
+      <w:numFmt w:val="decimal"/>
+      <w:lvlText w:val="%7."/>
+      <w:lvlJc w:val="left"/>
+      <w:pPr>
+        <w:ind w:left="5040" w:hanging="360"/>
+      </w:pPr>
+    </w:lvl>
+    <w:lvl w:ilvl="7" w:tplc="04090019" w:tentative="1">
+      <w:start w:val="1"/>
+      <w:numFmt w:val="lowerLetter"/>
+      <w:lvlText w:val="%8."/>
+      <w:lvlJc w:val="left"/>
+      <w:pPr>
+        <w:ind w:left="5760" w:hanging="360"/>
+      </w:pPr>
+    </w:lvl>
+    <w:lvl w:ilvl="8" w:tplc="0409001B" w:tentative="1">
+      <w:start w:val="1"/>
+      <w:numFmt w:val="lowerRoman"/>
+      <w:lvlText w:val="%9."/>
+      <w:lvlJc w:val="right"/>
+      <w:pPr>
+        <w:ind w:left="6480" w:hanging="180"/>
+      </w:pPr>
+    </w:lvl>
+  </w:abstractNum>
+  <w:abstractNum w:abstractNumId="21" w15:restartNumberingAfterBreak="0">
     <w:nsid w:val="588E05DF"/>
     <w:multiLevelType w:val="multilevel"/>
     <w:tmpl w:val="DA4AD95C"/>
@@ -7039,7 +7841,7 @@
       </w:rPr>
     </w:lvl>
   </w:abstractNum>
-  <w:abstractNum w:abstractNumId="14" w15:restartNumberingAfterBreak="0">
+  <w:abstractNum w:abstractNumId="22" w15:restartNumberingAfterBreak="0">
     <w:nsid w:val="5BA7657E"/>
     <w:multiLevelType w:val="multilevel"/>
     <w:tmpl w:val="A39294F6"/>
@@ -7143,7 +7945,7 @@
       </w:rPr>
     </w:lvl>
   </w:abstractNum>
-  <w:abstractNum w:abstractNumId="15" w15:restartNumberingAfterBreak="0">
+  <w:abstractNum w:abstractNumId="23" w15:restartNumberingAfterBreak="0">
     <w:nsid w:val="5BE81EB0"/>
     <w:multiLevelType w:val="multilevel"/>
     <w:tmpl w:val="02945C46"/>
@@ -7247,7 +8049,7 @@
       </w:rPr>
     </w:lvl>
   </w:abstractNum>
-  <w:abstractNum w:abstractNumId="16" w15:restartNumberingAfterBreak="0">
+  <w:abstractNum w:abstractNumId="24" w15:restartNumberingAfterBreak="0">
     <w:nsid w:val="63784447"/>
     <w:multiLevelType w:val="multilevel"/>
     <w:tmpl w:val="3B3A7FD6"/>
@@ -7333,7 +8135,7 @@
       </w:pPr>
     </w:lvl>
   </w:abstractNum>
-  <w:abstractNum w:abstractNumId="17" w15:restartNumberingAfterBreak="0">
+  <w:abstractNum w:abstractNumId="25" w15:restartNumberingAfterBreak="0">
     <w:nsid w:val="6ABD18B1"/>
     <w:multiLevelType w:val="multilevel"/>
     <w:tmpl w:val="B7140BA4"/>
@@ -7453,59 +8255,653 @@
       </w:rPr>
     </w:lvl>
   </w:abstractNum>
+  <w:abstractNum w:abstractNumId="26" w15:restartNumberingAfterBreak="0">
+    <w:nsid w:val="6B4756D2"/>
+    <w:multiLevelType w:val="multilevel"/>
+    <w:tmpl w:val="0409001F"/>
+    <w:lvl w:ilvl="0">
+      <w:start w:val="1"/>
+      <w:numFmt w:val="decimal"/>
+      <w:lvlText w:val="%1."/>
+      <w:lvlJc w:val="left"/>
+      <w:pPr>
+        <w:ind w:left="360" w:hanging="360"/>
+      </w:pPr>
+    </w:lvl>
+    <w:lvl w:ilvl="1">
+      <w:start w:val="1"/>
+      <w:numFmt w:val="decimal"/>
+      <w:lvlText w:val="%1.%2."/>
+      <w:lvlJc w:val="left"/>
+      <w:pPr>
+        <w:ind w:left="792" w:hanging="432"/>
+      </w:pPr>
+    </w:lvl>
+    <w:lvl w:ilvl="2">
+      <w:start w:val="1"/>
+      <w:numFmt w:val="decimal"/>
+      <w:lvlText w:val="%1.%2.%3."/>
+      <w:lvlJc w:val="left"/>
+      <w:pPr>
+        <w:ind w:left="1224" w:hanging="504"/>
+      </w:pPr>
+    </w:lvl>
+    <w:lvl w:ilvl="3">
+      <w:start w:val="1"/>
+      <w:numFmt w:val="decimal"/>
+      <w:lvlText w:val="%1.%2.%3.%4."/>
+      <w:lvlJc w:val="left"/>
+      <w:pPr>
+        <w:ind w:left="1728" w:hanging="648"/>
+      </w:pPr>
+    </w:lvl>
+    <w:lvl w:ilvl="4">
+      <w:start w:val="1"/>
+      <w:numFmt w:val="decimal"/>
+      <w:lvlText w:val="%1.%2.%3.%4.%5."/>
+      <w:lvlJc w:val="left"/>
+      <w:pPr>
+        <w:ind w:left="2232" w:hanging="792"/>
+      </w:pPr>
+    </w:lvl>
+    <w:lvl w:ilvl="5">
+      <w:start w:val="1"/>
+      <w:numFmt w:val="decimal"/>
+      <w:lvlText w:val="%1.%2.%3.%4.%5.%6."/>
+      <w:lvlJc w:val="left"/>
+      <w:pPr>
+        <w:ind w:left="2736" w:hanging="936"/>
+      </w:pPr>
+    </w:lvl>
+    <w:lvl w:ilvl="6">
+      <w:start w:val="1"/>
+      <w:numFmt w:val="decimal"/>
+      <w:lvlText w:val="%1.%2.%3.%4.%5.%6.%7."/>
+      <w:lvlJc w:val="left"/>
+      <w:pPr>
+        <w:ind w:left="3240" w:hanging="1080"/>
+      </w:pPr>
+    </w:lvl>
+    <w:lvl w:ilvl="7">
+      <w:start w:val="1"/>
+      <w:numFmt w:val="decimal"/>
+      <w:lvlText w:val="%1.%2.%3.%4.%5.%6.%7.%8."/>
+      <w:lvlJc w:val="left"/>
+      <w:pPr>
+        <w:ind w:left="3744" w:hanging="1224"/>
+      </w:pPr>
+    </w:lvl>
+    <w:lvl w:ilvl="8">
+      <w:start w:val="1"/>
+      <w:numFmt w:val="decimal"/>
+      <w:lvlText w:val="%1.%2.%3.%4.%5.%6.%7.%8.%9."/>
+      <w:lvlJc w:val="left"/>
+      <w:pPr>
+        <w:ind w:left="4320" w:hanging="1440"/>
+      </w:pPr>
+    </w:lvl>
+  </w:abstractNum>
+  <w:abstractNum w:abstractNumId="27" w15:restartNumberingAfterBreak="0">
+    <w:nsid w:val="730842EC"/>
+    <w:multiLevelType w:val="multilevel"/>
+    <w:tmpl w:val="419A210A"/>
+    <w:lvl w:ilvl="0">
+      <w:start w:val="7"/>
+      <w:numFmt w:val="decimal"/>
+      <w:lvlText w:val="%1"/>
+      <w:lvlJc w:val="left"/>
+      <w:pPr>
+        <w:ind w:left="360" w:hanging="360"/>
+      </w:pPr>
+      <w:rPr>
+        <w:rFonts w:ascii="TH Sarabun New" w:hAnsi="TH Sarabun New" w:hint="default"/>
+        <w:b/>
+      </w:rPr>
+    </w:lvl>
+    <w:lvl w:ilvl="1">
+      <w:start w:val="1"/>
+      <w:numFmt w:val="decimal"/>
+      <w:lvlText w:val="%1.%2"/>
+      <w:lvlJc w:val="left"/>
+      <w:pPr>
+        <w:ind w:left="1855" w:hanging="720"/>
+      </w:pPr>
+      <w:rPr>
+        <w:rFonts w:ascii="TH Sarabun New" w:hAnsi="TH Sarabun New" w:hint="default"/>
+        <w:b/>
+      </w:rPr>
+    </w:lvl>
+    <w:lvl w:ilvl="2">
+      <w:start w:val="1"/>
+      <w:numFmt w:val="decimal"/>
+      <w:lvlText w:val="%1.%2.%3"/>
+      <w:lvlJc w:val="left"/>
+      <w:pPr>
+        <w:ind w:left="1571" w:hanging="720"/>
+      </w:pPr>
+      <w:rPr>
+        <w:rFonts w:ascii="TH Sarabun New" w:hAnsi="TH Sarabun New" w:hint="default"/>
+        <w:b/>
+      </w:rPr>
+    </w:lvl>
+    <w:lvl w:ilvl="3">
+      <w:start w:val="1"/>
+      <w:numFmt w:val="decimal"/>
+      <w:lvlText w:val="%1.%2.%3.%4"/>
+      <w:lvlJc w:val="left"/>
+      <w:pPr>
+        <w:ind w:left="4485" w:hanging="1080"/>
+      </w:pPr>
+      <w:rPr>
+        <w:rFonts w:ascii="TH Sarabun New" w:hAnsi="TH Sarabun New" w:hint="default"/>
+        <w:b/>
+      </w:rPr>
+    </w:lvl>
+    <w:lvl w:ilvl="4">
+      <w:start w:val="1"/>
+      <w:numFmt w:val="decimal"/>
+      <w:lvlText w:val="%1.%2.%3.%4.%5"/>
+      <w:lvlJc w:val="left"/>
+      <w:pPr>
+        <w:ind w:left="5980" w:hanging="1440"/>
+      </w:pPr>
+      <w:rPr>
+        <w:rFonts w:ascii="TH Sarabun New" w:hAnsi="TH Sarabun New" w:hint="default"/>
+        <w:b/>
+      </w:rPr>
+    </w:lvl>
+    <w:lvl w:ilvl="5">
+      <w:start w:val="1"/>
+      <w:numFmt w:val="decimal"/>
+      <w:lvlText w:val="%1.%2.%3.%4.%5.%6"/>
+      <w:lvlJc w:val="left"/>
+      <w:pPr>
+        <w:ind w:left="7115" w:hanging="1440"/>
+      </w:pPr>
+      <w:rPr>
+        <w:rFonts w:ascii="TH Sarabun New" w:hAnsi="TH Sarabun New" w:hint="default"/>
+        <w:b/>
+      </w:rPr>
+    </w:lvl>
+    <w:lvl w:ilvl="6">
+      <w:start w:val="1"/>
+      <w:numFmt w:val="decimal"/>
+      <w:lvlText w:val="%1.%2.%3.%4.%5.%6.%7"/>
+      <w:lvlJc w:val="left"/>
+      <w:pPr>
+        <w:ind w:left="8610" w:hanging="1800"/>
+      </w:pPr>
+      <w:rPr>
+        <w:rFonts w:ascii="TH Sarabun New" w:hAnsi="TH Sarabun New" w:hint="default"/>
+        <w:b/>
+      </w:rPr>
+    </w:lvl>
+    <w:lvl w:ilvl="7">
+      <w:start w:val="1"/>
+      <w:numFmt w:val="decimal"/>
+      <w:lvlText w:val="%1.%2.%3.%4.%5.%6.%7.%8"/>
+      <w:lvlJc w:val="left"/>
+      <w:pPr>
+        <w:ind w:left="10105" w:hanging="2160"/>
+      </w:pPr>
+      <w:rPr>
+        <w:rFonts w:ascii="TH Sarabun New" w:hAnsi="TH Sarabun New" w:hint="default"/>
+        <w:b/>
+      </w:rPr>
+    </w:lvl>
+    <w:lvl w:ilvl="8">
+      <w:start w:val="1"/>
+      <w:numFmt w:val="decimal"/>
+      <w:lvlText w:val="%1.%2.%3.%4.%5.%6.%7.%8.%9"/>
+      <w:lvlJc w:val="left"/>
+      <w:pPr>
+        <w:ind w:left="11240" w:hanging="2160"/>
+      </w:pPr>
+      <w:rPr>
+        <w:rFonts w:ascii="TH Sarabun New" w:hAnsi="TH Sarabun New" w:hint="default"/>
+        <w:b/>
+      </w:rPr>
+    </w:lvl>
+  </w:abstractNum>
+  <w:abstractNum w:abstractNumId="28" w15:restartNumberingAfterBreak="0">
+    <w:nsid w:val="74F366FB"/>
+    <w:multiLevelType w:val="hybridMultilevel"/>
+    <w:tmpl w:val="0630D7F0"/>
+    <w:lvl w:ilvl="0" w:tplc="0409000F">
+      <w:start w:val="1"/>
+      <w:numFmt w:val="decimal"/>
+      <w:lvlText w:val="%1."/>
+      <w:lvlJc w:val="left"/>
+      <w:pPr>
+        <w:ind w:left="786" w:hanging="360"/>
+      </w:pPr>
+    </w:lvl>
+    <w:lvl w:ilvl="1" w:tplc="04090019" w:tentative="1">
+      <w:start w:val="1"/>
+      <w:numFmt w:val="lowerLetter"/>
+      <w:lvlText w:val="%2."/>
+      <w:lvlJc w:val="left"/>
+      <w:pPr>
+        <w:ind w:left="1506" w:hanging="360"/>
+      </w:pPr>
+    </w:lvl>
+    <w:lvl w:ilvl="2" w:tplc="0409001B" w:tentative="1">
+      <w:start w:val="1"/>
+      <w:numFmt w:val="lowerRoman"/>
+      <w:lvlText w:val="%3."/>
+      <w:lvlJc w:val="right"/>
+      <w:pPr>
+        <w:ind w:left="2226" w:hanging="180"/>
+      </w:pPr>
+    </w:lvl>
+    <w:lvl w:ilvl="3" w:tplc="0409000F" w:tentative="1">
+      <w:start w:val="1"/>
+      <w:numFmt w:val="decimal"/>
+      <w:lvlText w:val="%4."/>
+      <w:lvlJc w:val="left"/>
+      <w:pPr>
+        <w:ind w:left="2946" w:hanging="360"/>
+      </w:pPr>
+    </w:lvl>
+    <w:lvl w:ilvl="4" w:tplc="04090019" w:tentative="1">
+      <w:start w:val="1"/>
+      <w:numFmt w:val="lowerLetter"/>
+      <w:lvlText w:val="%5."/>
+      <w:lvlJc w:val="left"/>
+      <w:pPr>
+        <w:ind w:left="3666" w:hanging="360"/>
+      </w:pPr>
+    </w:lvl>
+    <w:lvl w:ilvl="5" w:tplc="0409001B" w:tentative="1">
+      <w:start w:val="1"/>
+      <w:numFmt w:val="lowerRoman"/>
+      <w:lvlText w:val="%6."/>
+      <w:lvlJc w:val="right"/>
+      <w:pPr>
+        <w:ind w:left="4386" w:hanging="180"/>
+      </w:pPr>
+    </w:lvl>
+    <w:lvl w:ilvl="6" w:tplc="0409000F" w:tentative="1">
+      <w:start w:val="1"/>
+      <w:numFmt w:val="decimal"/>
+      <w:lvlText w:val="%7."/>
+      <w:lvlJc w:val="left"/>
+      <w:pPr>
+        <w:ind w:left="5106" w:hanging="360"/>
+      </w:pPr>
+    </w:lvl>
+    <w:lvl w:ilvl="7" w:tplc="04090019" w:tentative="1">
+      <w:start w:val="1"/>
+      <w:numFmt w:val="lowerLetter"/>
+      <w:lvlText w:val="%8."/>
+      <w:lvlJc w:val="left"/>
+      <w:pPr>
+        <w:ind w:left="5826" w:hanging="360"/>
+      </w:pPr>
+    </w:lvl>
+    <w:lvl w:ilvl="8" w:tplc="0409001B" w:tentative="1">
+      <w:start w:val="1"/>
+      <w:numFmt w:val="lowerRoman"/>
+      <w:lvlText w:val="%9."/>
+      <w:lvlJc w:val="right"/>
+      <w:pPr>
+        <w:ind w:left="6546" w:hanging="180"/>
+      </w:pPr>
+    </w:lvl>
+  </w:abstractNum>
+  <w:abstractNum w:abstractNumId="29" w15:restartNumberingAfterBreak="0">
+    <w:nsid w:val="766D038E"/>
+    <w:multiLevelType w:val="multilevel"/>
+    <w:tmpl w:val="0409001F"/>
+    <w:lvl w:ilvl="0">
+      <w:start w:val="1"/>
+      <w:numFmt w:val="decimal"/>
+      <w:lvlText w:val="%1."/>
+      <w:lvlJc w:val="left"/>
+      <w:pPr>
+        <w:ind w:left="360" w:hanging="360"/>
+      </w:pPr>
+    </w:lvl>
+    <w:lvl w:ilvl="1">
+      <w:start w:val="1"/>
+      <w:numFmt w:val="decimal"/>
+      <w:lvlText w:val="%1.%2."/>
+      <w:lvlJc w:val="left"/>
+      <w:pPr>
+        <w:ind w:left="792" w:hanging="432"/>
+      </w:pPr>
+    </w:lvl>
+    <w:lvl w:ilvl="2">
+      <w:start w:val="1"/>
+      <w:numFmt w:val="decimal"/>
+      <w:lvlText w:val="%1.%2.%3."/>
+      <w:lvlJc w:val="left"/>
+      <w:pPr>
+        <w:ind w:left="1224" w:hanging="504"/>
+      </w:pPr>
+    </w:lvl>
+    <w:lvl w:ilvl="3">
+      <w:start w:val="1"/>
+      <w:numFmt w:val="decimal"/>
+      <w:lvlText w:val="%1.%2.%3.%4."/>
+      <w:lvlJc w:val="left"/>
+      <w:pPr>
+        <w:ind w:left="1728" w:hanging="648"/>
+      </w:pPr>
+    </w:lvl>
+    <w:lvl w:ilvl="4">
+      <w:start w:val="1"/>
+      <w:numFmt w:val="decimal"/>
+      <w:lvlText w:val="%1.%2.%3.%4.%5."/>
+      <w:lvlJc w:val="left"/>
+      <w:pPr>
+        <w:ind w:left="2232" w:hanging="792"/>
+      </w:pPr>
+    </w:lvl>
+    <w:lvl w:ilvl="5">
+      <w:start w:val="1"/>
+      <w:numFmt w:val="decimal"/>
+      <w:lvlText w:val="%1.%2.%3.%4.%5.%6."/>
+      <w:lvlJc w:val="left"/>
+      <w:pPr>
+        <w:ind w:left="2736" w:hanging="936"/>
+      </w:pPr>
+    </w:lvl>
+    <w:lvl w:ilvl="6">
+      <w:start w:val="1"/>
+      <w:numFmt w:val="decimal"/>
+      <w:lvlText w:val="%1.%2.%3.%4.%5.%6.%7."/>
+      <w:lvlJc w:val="left"/>
+      <w:pPr>
+        <w:ind w:left="3240" w:hanging="1080"/>
+      </w:pPr>
+    </w:lvl>
+    <w:lvl w:ilvl="7">
+      <w:start w:val="1"/>
+      <w:numFmt w:val="decimal"/>
+      <w:lvlText w:val="%1.%2.%3.%4.%5.%6.%7.%8."/>
+      <w:lvlJc w:val="left"/>
+      <w:pPr>
+        <w:ind w:left="3744" w:hanging="1224"/>
+      </w:pPr>
+    </w:lvl>
+    <w:lvl w:ilvl="8">
+      <w:start w:val="1"/>
+      <w:numFmt w:val="decimal"/>
+      <w:lvlText w:val="%1.%2.%3.%4.%5.%6.%7.%8.%9."/>
+      <w:lvlJc w:val="left"/>
+      <w:pPr>
+        <w:ind w:left="4320" w:hanging="1440"/>
+      </w:pPr>
+    </w:lvl>
+  </w:abstractNum>
+  <w:abstractNum w:abstractNumId="30" w15:restartNumberingAfterBreak="0">
+    <w:nsid w:val="7B2B017C"/>
+    <w:multiLevelType w:val="hybridMultilevel"/>
+    <w:tmpl w:val="64C0A228"/>
+    <w:lvl w:ilvl="0" w:tplc="0409000F">
+      <w:start w:val="1"/>
+      <w:numFmt w:val="decimal"/>
+      <w:lvlText w:val="%1."/>
+      <w:lvlJc w:val="left"/>
+      <w:pPr>
+        <w:ind w:left="1429" w:hanging="360"/>
+      </w:pPr>
+    </w:lvl>
+    <w:lvl w:ilvl="1" w:tplc="04090019" w:tentative="1">
+      <w:start w:val="1"/>
+      <w:numFmt w:val="lowerLetter"/>
+      <w:lvlText w:val="%2."/>
+      <w:lvlJc w:val="left"/>
+      <w:pPr>
+        <w:ind w:left="2149" w:hanging="360"/>
+      </w:pPr>
+    </w:lvl>
+    <w:lvl w:ilvl="2" w:tplc="0409001B" w:tentative="1">
+      <w:start w:val="1"/>
+      <w:numFmt w:val="lowerRoman"/>
+      <w:lvlText w:val="%3."/>
+      <w:lvlJc w:val="right"/>
+      <w:pPr>
+        <w:ind w:left="2869" w:hanging="180"/>
+      </w:pPr>
+    </w:lvl>
+    <w:lvl w:ilvl="3" w:tplc="0409000F" w:tentative="1">
+      <w:start w:val="1"/>
+      <w:numFmt w:val="decimal"/>
+      <w:lvlText w:val="%4."/>
+      <w:lvlJc w:val="left"/>
+      <w:pPr>
+        <w:ind w:left="3589" w:hanging="360"/>
+      </w:pPr>
+    </w:lvl>
+    <w:lvl w:ilvl="4" w:tplc="04090019" w:tentative="1">
+      <w:start w:val="1"/>
+      <w:numFmt w:val="lowerLetter"/>
+      <w:lvlText w:val="%5."/>
+      <w:lvlJc w:val="left"/>
+      <w:pPr>
+        <w:ind w:left="4309" w:hanging="360"/>
+      </w:pPr>
+    </w:lvl>
+    <w:lvl w:ilvl="5" w:tplc="0409001B" w:tentative="1">
+      <w:start w:val="1"/>
+      <w:numFmt w:val="lowerRoman"/>
+      <w:lvlText w:val="%6."/>
+      <w:lvlJc w:val="right"/>
+      <w:pPr>
+        <w:ind w:left="5029" w:hanging="180"/>
+      </w:pPr>
+    </w:lvl>
+    <w:lvl w:ilvl="6" w:tplc="0409000F" w:tentative="1">
+      <w:start w:val="1"/>
+      <w:numFmt w:val="decimal"/>
+      <w:lvlText w:val="%7."/>
+      <w:lvlJc w:val="left"/>
+      <w:pPr>
+        <w:ind w:left="5749" w:hanging="360"/>
+      </w:pPr>
+    </w:lvl>
+    <w:lvl w:ilvl="7" w:tplc="04090019" w:tentative="1">
+      <w:start w:val="1"/>
+      <w:numFmt w:val="lowerLetter"/>
+      <w:lvlText w:val="%8."/>
+      <w:lvlJc w:val="left"/>
+      <w:pPr>
+        <w:ind w:left="6469" w:hanging="360"/>
+      </w:pPr>
+    </w:lvl>
+    <w:lvl w:ilvl="8" w:tplc="0409001B" w:tentative="1">
+      <w:start w:val="1"/>
+      <w:numFmt w:val="lowerRoman"/>
+      <w:lvlText w:val="%9."/>
+      <w:lvlJc w:val="right"/>
+      <w:pPr>
+        <w:ind w:left="7189" w:hanging="180"/>
+      </w:pPr>
+    </w:lvl>
+  </w:abstractNum>
+  <w:abstractNum w:abstractNumId="31" w15:restartNumberingAfterBreak="0">
+    <w:nsid w:val="7F040FD1"/>
+    <w:multiLevelType w:val="hybridMultilevel"/>
+    <w:tmpl w:val="EAA8D4AC"/>
+    <w:lvl w:ilvl="0" w:tplc="0409000F">
+      <w:start w:val="1"/>
+      <w:numFmt w:val="decimal"/>
+      <w:lvlText w:val="%1."/>
+      <w:lvlJc w:val="left"/>
+      <w:pPr>
+        <w:ind w:left="720" w:hanging="360"/>
+      </w:pPr>
+    </w:lvl>
+    <w:lvl w:ilvl="1" w:tplc="04090019" w:tentative="1">
+      <w:start w:val="1"/>
+      <w:numFmt w:val="lowerLetter"/>
+      <w:lvlText w:val="%2."/>
+      <w:lvlJc w:val="left"/>
+      <w:pPr>
+        <w:ind w:left="1440" w:hanging="360"/>
+      </w:pPr>
+    </w:lvl>
+    <w:lvl w:ilvl="2" w:tplc="0409001B" w:tentative="1">
+      <w:start w:val="1"/>
+      <w:numFmt w:val="lowerRoman"/>
+      <w:lvlText w:val="%3."/>
+      <w:lvlJc w:val="right"/>
+      <w:pPr>
+        <w:ind w:left="2160" w:hanging="180"/>
+      </w:pPr>
+    </w:lvl>
+    <w:lvl w:ilvl="3" w:tplc="0409000F" w:tentative="1">
+      <w:start w:val="1"/>
+      <w:numFmt w:val="decimal"/>
+      <w:lvlText w:val="%4."/>
+      <w:lvlJc w:val="left"/>
+      <w:pPr>
+        <w:ind w:left="2880" w:hanging="360"/>
+      </w:pPr>
+    </w:lvl>
+    <w:lvl w:ilvl="4" w:tplc="04090019" w:tentative="1">
+      <w:start w:val="1"/>
+      <w:numFmt w:val="lowerLetter"/>
+      <w:lvlText w:val="%5."/>
+      <w:lvlJc w:val="left"/>
+      <w:pPr>
+        <w:ind w:left="3600" w:hanging="360"/>
+      </w:pPr>
+    </w:lvl>
+    <w:lvl w:ilvl="5" w:tplc="0409001B" w:tentative="1">
+      <w:start w:val="1"/>
+      <w:numFmt w:val="lowerRoman"/>
+      <w:lvlText w:val="%6."/>
+      <w:lvlJc w:val="right"/>
+      <w:pPr>
+        <w:ind w:left="4320" w:hanging="180"/>
+      </w:pPr>
+    </w:lvl>
+    <w:lvl w:ilvl="6" w:tplc="0409000F" w:tentative="1">
+      <w:start w:val="1"/>
+      <w:numFmt w:val="decimal"/>
+      <w:lvlText w:val="%7."/>
+      <w:lvlJc w:val="left"/>
+      <w:pPr>
+        <w:ind w:left="5040" w:hanging="360"/>
+      </w:pPr>
+    </w:lvl>
+    <w:lvl w:ilvl="7" w:tplc="04090019" w:tentative="1">
+      <w:start w:val="1"/>
+      <w:numFmt w:val="lowerLetter"/>
+      <w:lvlText w:val="%8."/>
+      <w:lvlJc w:val="left"/>
+      <w:pPr>
+        <w:ind w:left="5760" w:hanging="360"/>
+      </w:pPr>
+    </w:lvl>
+    <w:lvl w:ilvl="8" w:tplc="0409001B" w:tentative="1">
+      <w:start w:val="1"/>
+      <w:numFmt w:val="lowerRoman"/>
+      <w:lvlText w:val="%9."/>
+      <w:lvlJc w:val="right"/>
+      <w:pPr>
+        <w:ind w:left="6480" w:hanging="180"/>
+      </w:pPr>
+    </w:lvl>
+  </w:abstractNum>
   <w:num w:numId="1" w16cid:durableId="4938563">
+    <w:abstractNumId w:val="5"/>
+  </w:num>
+  <w:num w:numId="2" w16cid:durableId="1291670171">
+    <w:abstractNumId w:val="19"/>
+  </w:num>
+  <w:num w:numId="3" w16cid:durableId="424694116">
+    <w:abstractNumId w:val="16"/>
+  </w:num>
+  <w:num w:numId="4" w16cid:durableId="1766148621">
+    <w:abstractNumId w:val="14"/>
+  </w:num>
+  <w:num w:numId="5" w16cid:durableId="1500462468">
+    <w:abstractNumId w:val="2"/>
+  </w:num>
+  <w:num w:numId="6" w16cid:durableId="400640706">
+    <w:abstractNumId w:val="15"/>
+  </w:num>
+  <w:num w:numId="7" w16cid:durableId="979312602">
+    <w:abstractNumId w:val="13"/>
+  </w:num>
+  <w:num w:numId="8" w16cid:durableId="1926375224">
+    <w:abstractNumId w:val="10"/>
+  </w:num>
+  <w:num w:numId="9" w16cid:durableId="147022736">
+    <w:abstractNumId w:val="22"/>
+  </w:num>
+  <w:num w:numId="10" w16cid:durableId="1278021584">
+    <w:abstractNumId w:val="18"/>
+  </w:num>
+  <w:num w:numId="11" w16cid:durableId="1219827715">
+    <w:abstractNumId w:val="24"/>
+  </w:num>
+  <w:num w:numId="12" w16cid:durableId="618731563">
+    <w:abstractNumId w:val="21"/>
+  </w:num>
+  <w:num w:numId="13" w16cid:durableId="1119563986">
+    <w:abstractNumId w:val="23"/>
+  </w:num>
+  <w:num w:numId="14" w16cid:durableId="1178156381">
+    <w:abstractNumId w:val="4"/>
+  </w:num>
+  <w:num w:numId="15" w16cid:durableId="1843546599">
+    <w:abstractNumId w:val="25"/>
+  </w:num>
+  <w:num w:numId="16" w16cid:durableId="869412714">
+    <w:abstractNumId w:val="12"/>
+  </w:num>
+  <w:num w:numId="17" w16cid:durableId="1786804960">
+    <w:abstractNumId w:val="8"/>
+  </w:num>
+  <w:num w:numId="18" w16cid:durableId="72824368">
     <w:abstractNumId w:val="3"/>
   </w:num>
-  <w:num w:numId="2" w16cid:durableId="1291670171">
-    <w:abstractNumId w:val="12"/>
+  <w:num w:numId="19" w16cid:durableId="1965042778">
+    <w:abstractNumId w:val="9"/>
   </w:num>
-  <w:num w:numId="3" w16cid:durableId="424694116">
-    <w:abstractNumId w:val="10"/>
+  <w:num w:numId="20" w16cid:durableId="662002578">
+    <w:abstractNumId w:val="17"/>
   </w:num>
-  <w:num w:numId="4" w16cid:durableId="1766148621">
-    <w:abstractNumId w:val="8"/>
-  </w:num>
-  <w:num w:numId="5" w16cid:durableId="1500462468">
+  <w:num w:numId="21" w16cid:durableId="447361260">
     <w:abstractNumId w:val="0"/>
   </w:num>
-  <w:num w:numId="6" w16cid:durableId="400640706">
-    <w:abstractNumId w:val="9"/>
+  <w:num w:numId="22" w16cid:durableId="1858620141">
+    <w:abstractNumId w:val="1"/>
   </w:num>
-  <w:num w:numId="7" w16cid:durableId="979312602">
+  <w:num w:numId="23" w16cid:durableId="170726119">
+    <w:abstractNumId w:val="26"/>
+  </w:num>
+  <w:num w:numId="24" w16cid:durableId="159152865">
+    <w:abstractNumId w:val="20"/>
+  </w:num>
+  <w:num w:numId="25" w16cid:durableId="1874732813">
+    <w:abstractNumId w:val="27"/>
+  </w:num>
+  <w:num w:numId="26" w16cid:durableId="279991125">
+    <w:abstractNumId w:val="6"/>
+  </w:num>
+  <w:num w:numId="27" w16cid:durableId="1159921877">
     <w:abstractNumId w:val="7"/>
   </w:num>
-  <w:num w:numId="8" w16cid:durableId="1926375224">
-    <w:abstractNumId w:val="5"/>
-  </w:num>
-  <w:num w:numId="9" w16cid:durableId="147022736">
-    <w:abstractNumId w:val="14"/>
-  </w:num>
-  <w:num w:numId="10" w16cid:durableId="1278021584">
+  <w:num w:numId="28" w16cid:durableId="137649159">
     <w:abstractNumId w:val="11"/>
   </w:num>
-  <w:num w:numId="11" w16cid:durableId="1219827715">
-    <w:abstractNumId w:val="16"/>
+  <w:num w:numId="29" w16cid:durableId="929463240">
+    <w:abstractNumId w:val="29"/>
   </w:num>
-  <w:num w:numId="12" w16cid:durableId="618731563">
-    <w:abstractNumId w:val="13"/>
+  <w:num w:numId="30" w16cid:durableId="1087774514">
+    <w:abstractNumId w:val="28"/>
   </w:num>
-  <w:num w:numId="13" w16cid:durableId="1119563986">
-    <w:abstractNumId w:val="15"/>
+  <w:num w:numId="31" w16cid:durableId="1979144083">
+    <w:abstractNumId w:val="30"/>
   </w:num>
-  <w:num w:numId="14" w16cid:durableId="1178156381">
-    <w:abstractNumId w:val="2"/>
-  </w:num>
-  <w:num w:numId="15" w16cid:durableId="1843546599">
-    <w:abstractNumId w:val="17"/>
-  </w:num>
-  <w:num w:numId="16" w16cid:durableId="869412714">
-    <w:abstractNumId w:val="6"/>
-  </w:num>
-  <w:num w:numId="17" w16cid:durableId="1786804960">
-    <w:abstractNumId w:val="4"/>
-  </w:num>
-  <w:num w:numId="18" w16cid:durableId="72824368">
-    <w:abstractNumId w:val="1"/>
+  <w:num w:numId="32" w16cid:durableId="371737106">
+    <w:abstractNumId w:val="31"/>
   </w:num>
 </w:numbering>
 </file>
@@ -7910,6 +9306,12 @@
   <w:style w:type="paragraph" w:default="1" w:styleId="Normal">
     <w:name w:val="Normal"/>
     <w:qFormat/>
+    <w:rsid w:val="00C26675"/>
+    <w:rPr>
+      <w:rFonts w:cs="TH Sarabun New"/>
+      <w:color w:val="000000" w:themeColor="text1"/>
+      <w:szCs w:val="32"/>
+    </w:rPr>
   </w:style>
   <w:style w:type="paragraph" w:styleId="Heading1">
     <w:name w:val="heading 1"/>
@@ -7926,9 +9328,8 @@
       <w:outlineLvl w:val="0"/>
     </w:pPr>
     <w:rPr>
-      <w:rFonts w:asciiTheme="majorHAnsi" w:eastAsiaTheme="majorEastAsia" w:hAnsiTheme="majorHAnsi" w:cs="TH Sarabun New"/>
+      <w:rFonts w:asciiTheme="majorHAnsi" w:eastAsiaTheme="majorEastAsia" w:hAnsiTheme="majorHAnsi"/>
       <w:bCs/>
-      <w:color w:val="000000" w:themeColor="text1"/>
       <w:sz w:val="32"/>
       <w:szCs w:val="36"/>
     </w:rPr>
@@ -7941,7 +9342,7 @@
     <w:uiPriority w:val="9"/>
     <w:unhideWhenUsed/>
     <w:qFormat/>
-    <w:rsid w:val="00483578"/>
+    <w:rsid w:val="00C26675"/>
     <w:pPr>
       <w:keepNext/>
       <w:keepLines/>
@@ -7949,10 +9350,8 @@
       <w:outlineLvl w:val="1"/>
     </w:pPr>
     <w:rPr>
-      <w:rFonts w:asciiTheme="majorHAnsi" w:eastAsiaTheme="majorEastAsia" w:hAnsiTheme="majorHAnsi" w:cs="Mangal"/>
-      <w:color w:val="0F4761" w:themeColor="accent1" w:themeShade="BF"/>
+      <w:rFonts w:asciiTheme="majorHAnsi" w:eastAsiaTheme="majorEastAsia" w:hAnsiTheme="majorHAnsi"/>
       <w:sz w:val="26"/>
-      <w:szCs w:val="23"/>
     </w:rPr>
   </w:style>
   <w:style w:type="paragraph" w:styleId="Heading3">
@@ -7963,7 +9362,7 @@
     <w:uiPriority w:val="9"/>
     <w:unhideWhenUsed/>
     <w:qFormat/>
-    <w:rsid w:val="00483578"/>
+    <w:rsid w:val="00C26675"/>
     <w:pPr>
       <w:keepNext/>
       <w:keepLines/>
@@ -7971,9 +9370,7 @@
       <w:outlineLvl w:val="2"/>
     </w:pPr>
     <w:rPr>
-      <w:rFonts w:asciiTheme="majorHAnsi" w:eastAsiaTheme="majorEastAsia" w:hAnsiTheme="majorHAnsi" w:cs="Mangal"/>
-      <w:color w:val="0A2F40" w:themeColor="accent1" w:themeShade="7F"/>
-      <w:szCs w:val="21"/>
+      <w:rFonts w:asciiTheme="majorHAnsi" w:eastAsiaTheme="majorEastAsia" w:hAnsiTheme="majorHAnsi"/>
     </w:rPr>
   </w:style>
   <w:style w:type="paragraph" w:styleId="Heading4">
@@ -8385,12 +9782,12 @@
     <w:basedOn w:val="DefaultParagraphFont"/>
     <w:link w:val="Heading2"/>
     <w:uiPriority w:val="9"/>
-    <w:rsid w:val="00483578"/>
+    <w:rsid w:val="00C26675"/>
     <w:rPr>
-      <w:rFonts w:asciiTheme="majorHAnsi" w:eastAsiaTheme="majorEastAsia" w:hAnsiTheme="majorHAnsi" w:cs="Mangal"/>
-      <w:color w:val="0F4761" w:themeColor="accent1" w:themeShade="BF"/>
+      <w:rFonts w:asciiTheme="majorHAnsi" w:eastAsiaTheme="majorEastAsia" w:hAnsiTheme="majorHAnsi" w:cs="TH Sarabun New"/>
+      <w:color w:val="000000" w:themeColor="text1"/>
       <w:sz w:val="26"/>
-      <w:szCs w:val="23"/>
+      <w:szCs w:val="32"/>
     </w:rPr>
   </w:style>
   <w:style w:type="character" w:customStyle="1" w:styleId="Heading3Char">
@@ -8398,11 +9795,11 @@
     <w:basedOn w:val="DefaultParagraphFont"/>
     <w:link w:val="Heading3"/>
     <w:uiPriority w:val="9"/>
-    <w:rsid w:val="00483578"/>
+    <w:rsid w:val="00C26675"/>
     <w:rPr>
-      <w:rFonts w:asciiTheme="majorHAnsi" w:eastAsiaTheme="majorEastAsia" w:hAnsiTheme="majorHAnsi" w:cs="Mangal"/>
-      <w:color w:val="0A2F40" w:themeColor="accent1" w:themeShade="7F"/>
-      <w:szCs w:val="21"/>
+      <w:rFonts w:asciiTheme="majorHAnsi" w:eastAsiaTheme="majorEastAsia" w:hAnsiTheme="majorHAnsi" w:cs="TH Sarabun New"/>
+      <w:color w:val="000000" w:themeColor="text1"/>
+      <w:szCs w:val="32"/>
     </w:rPr>
   </w:style>
   <w:style w:type="paragraph" w:styleId="ListParagraph">

</xml_diff>